<commit_message>
add file surat 1-4 into file storage
</commit_message>
<xml_diff>
--- a/project/kepegawaian/surat keterangan kepegawaian/surat1.docx
+++ b/project/kepegawaian/surat keterangan kepegawaian/surat1.docx
@@ -1,11 +1,11 @@
 
 <file path=word/document.xml><?xml version="1.0" encoding="utf-8"?>
-<w:document xmlns:wpc="http://schemas.microsoft.com/office/word/2010/wordprocessingCanvas" xmlns:cx="http://schemas.microsoft.com/office/drawing/2014/chartex" xmlns:cx1="http://schemas.microsoft.com/office/drawing/2015/9/8/chartex" xmlns:cx2="http://schemas.microsoft.com/office/drawing/2015/10/21/chartex" xmlns:cx3="http://schemas.microsoft.com/office/drawing/2016/5/9/chartex" xmlns:cx4="http://schemas.microsoft.com/office/drawing/2016/5/10/chartex" xmlns:cx5="http://schemas.microsoft.com/office/drawing/2016/5/11/chartex" xmlns:cx6="http://schemas.microsoft.com/office/drawing/2016/5/12/chartex" xmlns:cx7="http://schemas.microsoft.com/office/drawing/2016/5/13/chartex" xmlns:cx8="http://schemas.microsoft.com/office/drawing/2016/5/14/chartex" xmlns:mc="http://schemas.openxmlformats.org/markup-compatibility/2006" xmlns:aink="http://schemas.microsoft.com/office/drawing/2016/ink" xmlns:am3d="http://schemas.microsoft.com/office/drawing/2017/model3d" xmlns:o="urn:schemas-microsoft-com:office:office" xmlns:oel="http://schemas.microsoft.com/office/2019/extlst" xmlns:r="http://schemas.openxmlformats.org/officeDocument/2006/relationships" xmlns:m="http://schemas.openxmlformats.org/officeDocument/2006/math" xmlns:v="urn:schemas-microsoft-com:vml" xmlns:wp14="http://schemas.microsoft.com/office/word/2010/wordprocessingDrawing" xmlns:wp="http://schemas.openxmlformats.org/drawingml/2006/wordprocessingDrawing" xmlns:w10="urn:schemas-microsoft-com:office:word" xmlns:w="http://schemas.openxmlformats.org/wordprocessingml/2006/main" xmlns:w14="http://schemas.microsoft.com/office/word/2010/wordml" xmlns:w15="http://schemas.microsoft.com/office/word/2012/wordml" xmlns:w16cex="http://schemas.microsoft.com/office/word/2018/wordml/cex" xmlns:w16cid="http://schemas.microsoft.com/office/word/2016/wordml/cid" xmlns:w16="http://schemas.microsoft.com/office/word/2018/wordml" xmlns:w16du="http://schemas.microsoft.com/office/word/2023/wordml/word16du" xmlns:w16sdtdh="http://schemas.microsoft.com/office/word/2020/wordml/sdtdatahash" xmlns:w16se="http://schemas.microsoft.com/office/word/2015/wordml/symex" xmlns:wpg="http://schemas.microsoft.com/office/word/2010/wordprocessingGroup" xmlns:wpi="http://schemas.microsoft.com/office/word/2010/wordprocessingInk" xmlns:wne="http://schemas.microsoft.com/office/word/2006/wordml" xmlns:wps="http://schemas.microsoft.com/office/word/2010/wordprocessingShape" mc:Ignorable="w14 w15 w16se w16cid w16 w16cex w16sdtdh w16du wp14">
+<w:document xmlns:wpc="http://schemas.microsoft.com/office/word/2010/wordprocessingCanvas" xmlns:cx="http://schemas.microsoft.com/office/drawing/2014/chartex" xmlns:cx1="http://schemas.microsoft.com/office/drawing/2015/9/8/chartex" xmlns:cx2="http://schemas.microsoft.com/office/drawing/2015/10/21/chartex" xmlns:cx3="http://schemas.microsoft.com/office/drawing/2016/5/9/chartex" xmlns:cx4="http://schemas.microsoft.com/office/drawing/2016/5/10/chartex" xmlns:cx5="http://schemas.microsoft.com/office/drawing/2016/5/11/chartex" xmlns:cx6="http://schemas.microsoft.com/office/drawing/2016/5/12/chartex" xmlns:cx7="http://schemas.microsoft.com/office/drawing/2016/5/13/chartex" xmlns:cx8="http://schemas.microsoft.com/office/drawing/2016/5/14/chartex" xmlns:mc="http://schemas.openxmlformats.org/markup-compatibility/2006" xmlns:aink="http://schemas.microsoft.com/office/drawing/2016/ink" xmlns:am3d="http://schemas.microsoft.com/office/drawing/2017/model3d" xmlns:o="urn:schemas-microsoft-com:office:office" xmlns:oel="http://schemas.microsoft.com/office/2019/extlst" xmlns:r="http://schemas.openxmlformats.org/officeDocument/2006/relationships" xmlns:m="http://schemas.openxmlformats.org/officeDocument/2006/math" xmlns:v="urn:schemas-microsoft-com:vml" xmlns:wp14="http://schemas.microsoft.com/office/word/2010/wordprocessingDrawing" xmlns:wp="http://schemas.openxmlformats.org/drawingml/2006/wordprocessingDrawing" xmlns:w10="urn:schemas-microsoft-com:office:word" xmlns:w="http://schemas.openxmlformats.org/wordprocessingml/2006/main" xmlns:w14="http://schemas.microsoft.com/office/word/2010/wordml" xmlns:w15="http://schemas.microsoft.com/office/word/2012/wordml" xmlns:w16cex="http://schemas.microsoft.com/office/word/2018/wordml/cex" xmlns:w16cid="http://schemas.microsoft.com/office/word/2016/wordml/cid" xmlns:w16="http://schemas.microsoft.com/office/word/2018/wordml" xmlns:w16sdtdh="http://schemas.microsoft.com/office/word/2020/wordml/sdtdatahash" xmlns:w16se="http://schemas.microsoft.com/office/word/2015/wordml/symex" xmlns:wpg="http://schemas.microsoft.com/office/word/2010/wordprocessingGroup" xmlns:wpi="http://schemas.microsoft.com/office/word/2010/wordprocessingInk" xmlns:wne="http://schemas.microsoft.com/office/word/2006/wordml" xmlns:wps="http://schemas.microsoft.com/office/word/2010/wordprocessingShape" mc:Ignorable="w14 w15 w16se w16cid w16 w16cex w16sdtdh wp14">
   <w:body>
     <w:p>
       <w:pPr>
         <w:pStyle w:val="ListParagraph"/>
-        <w:spacing w:line="240" w:lineRule="auto"/>
+        <w:ind w:left="284"/>
         <w:jc w:val="center"/>
         <w:rPr>
           <w:rFonts w:ascii="Times New Roman" w:hAnsi="Times New Roman" w:cs="Times New Roman"/>
@@ -32,30 +32,79 @@
       <w:pPr>
         <w:pStyle w:val="ListParagraph"/>
         <w:spacing w:line="240" w:lineRule="auto"/>
+        <w:ind w:left="284"/>
         <w:jc w:val="center"/>
         <w:rPr>
           <w:rFonts w:ascii="Times New Roman" w:hAnsi="Times New Roman" w:cs="Times New Roman"/>
           <w:noProof/>
-          <w:sz w:val="24"/>
-          <w:szCs w:val="24"/>
+          <w:sz w:val="28"/>
+          <w:szCs w:val="28"/>
+          <w:lang w:val="en-US"/>
         </w:rPr>
       </w:pPr>
       <w:r>
         <w:rPr>
           <w:rFonts w:ascii="Times New Roman" w:hAnsi="Times New Roman" w:cs="Times New Roman"/>
           <w:noProof/>
-          <w:sz w:val="24"/>
-          <w:szCs w:val="24"/>
+          <w:sz w:val="28"/>
+          <w:szCs w:val="28"/>
         </w:rPr>
         <w:t xml:space="preserve">Nomor :   </w:t>
       </w:r>
       <w:r>
         <w:rPr>
           <w:rFonts w:ascii="Times New Roman" w:hAnsi="Times New Roman"/>
-          <w:sz w:val="24"/>
-          <w:szCs w:val="24"/>
-        </w:rPr>
-        <w:t xml:space="preserve">     /KET/DIR/III.6.AU/PKUSKH/2024</w:t>
+          <w:sz w:val="28"/>
+          <w:szCs w:val="28"/>
+        </w:rPr>
+        <w:t xml:space="preserve">     /KET/DIR/III.6.AU/PKUSKH/</w:t>
+      </w:r>
+      <w:r>
+        <w:rPr>
+          <w:rFonts w:ascii="Times New Roman" w:hAnsi="Times New Roman"/>
+          <w:sz w:val="28"/>
+          <w:szCs w:val="28"/>
+          <w:lang w:val="en-US"/>
+        </w:rPr>
+        <w:t>${</w:t>
+      </w:r>
+      <w:proofErr w:type="spellStart"/>
+      <w:r>
+        <w:rPr>
+          <w:rFonts w:ascii="Times New Roman" w:hAnsi="Times New Roman"/>
+          <w:sz w:val="28"/>
+          <w:szCs w:val="28"/>
+          <w:lang w:val="en-US"/>
+        </w:rPr>
+        <w:t>th</w:t>
+      </w:r>
+      <w:r>
+        <w:rPr>
+          <w:rFonts w:ascii="Times New Roman" w:hAnsi="Times New Roman"/>
+          <w:sz w:val="28"/>
+          <w:szCs w:val="28"/>
+          <w:lang w:val="en-US"/>
+        </w:rPr>
+        <w:t>_</w:t>
+      </w:r>
+      <w:r>
+        <w:rPr>
+          <w:rFonts w:ascii="Times New Roman" w:hAnsi="Times New Roman"/>
+          <w:sz w:val="28"/>
+          <w:szCs w:val="28"/>
+          <w:lang w:val="en-US"/>
+        </w:rPr>
+        <w:t>surat</w:t>
+      </w:r>
+      <w:proofErr w:type="spellEnd"/>
+      <w:r>
+        <w:rPr>
+          <w:rFonts w:ascii="Times New Roman" w:hAnsi="Times New Roman"/>
+          <w:sz w:val="28"/>
+          <w:szCs w:val="28"/>
+          <w:lang w:val="en-US"/>
+        </w:rPr>
+        <w:t>}</w:t>
       </w:r>
     </w:p>
     <w:p>
@@ -183,7 +232,7 @@
     <w:p>
       <w:pPr>
         <w:spacing w:after="0" w:line="360" w:lineRule="auto"/>
-        <w:ind w:left="284"/>
+        <w:ind w:left="567" w:right="709"/>
         <w:jc w:val="both"/>
         <w:rPr>
           <w:rFonts w:ascii="Times New Roman" w:hAnsi="Times New Roman"/>
@@ -191,6 +240,7 @@
           <w:szCs w:val="24"/>
         </w:rPr>
       </w:pPr>
+      <w:bookmarkStart w:id="0" w:name="_Hlk188013764"/>
       <w:r>
         <w:rPr>
           <w:rFonts w:ascii="Times New Roman" w:hAnsi="Times New Roman"/>
@@ -199,27 +249,30 @@
         </w:rPr>
         <w:t xml:space="preserve">Yang bertandatangan dibawah ini </w:t>
       </w:r>
+      <w:bookmarkStart w:id="1" w:name="_Hlk188013240"/>
     </w:p>
     <w:p>
       <w:pPr>
         <w:tabs>
-          <w:tab w:val="left" w:pos="567"/>
+          <w:tab w:val="left" w:pos="3544"/>
         </w:tabs>
         <w:spacing w:after="0" w:line="360" w:lineRule="auto"/>
+        <w:ind w:left="3544" w:right="709" w:hanging="2977"/>
         <w:jc w:val="both"/>
         <w:rPr>
           <w:rFonts w:ascii="Times New Roman" w:hAnsi="Times New Roman"/>
           <w:sz w:val="24"/>
           <w:szCs w:val="24"/>
-        </w:rPr>
-      </w:pPr>
-      <w:r>
-        <w:rPr>
-          <w:rFonts w:ascii="Times New Roman" w:hAnsi="Times New Roman"/>
-          <w:sz w:val="24"/>
-          <w:szCs w:val="24"/>
-        </w:rPr>
-        <w:t xml:space="preserve">         Nama</w:t>
+          <w:lang w:val="en-US"/>
+        </w:rPr>
+      </w:pPr>
+      <w:r>
+        <w:rPr>
+          <w:rFonts w:ascii="Times New Roman" w:hAnsi="Times New Roman"/>
+          <w:sz w:val="24"/>
+          <w:szCs w:val="24"/>
+        </w:rPr>
+        <w:t xml:space="preserve">    Nama</w:t>
       </w:r>
       <w:r>
         <w:rPr>
@@ -236,30 +289,42 @@
           <w:szCs w:val="24"/>
         </w:rPr>
         <w:tab/>
-        <w:t xml:space="preserve">  </w:t>
-      </w:r>
-      <w:r>
-        <w:rPr>
-          <w:rFonts w:ascii="Times New Roman" w:hAnsi="Times New Roman"/>
-          <w:sz w:val="24"/>
-          <w:szCs w:val="24"/>
-        </w:rPr>
-        <w:tab/>
-      </w:r>
-      <w:r>
-        <w:rPr>
-          <w:rFonts w:ascii="Times New Roman" w:hAnsi="Times New Roman"/>
-          <w:sz w:val="24"/>
-          <w:szCs w:val="24"/>
-        </w:rPr>
-        <w:tab/>
-        <w:t>: dr. Indarto, M.Si., M.M</w:t>
+        <w:t xml:space="preserve">: </w:t>
+      </w:r>
+      <w:r>
+        <w:rPr>
+          <w:rFonts w:ascii="Times New Roman" w:hAnsi="Times New Roman"/>
+          <w:sz w:val="24"/>
+          <w:szCs w:val="24"/>
+          <w:lang w:val="en-US"/>
+        </w:rPr>
+        <w:t>${</w:t>
+      </w:r>
+      <w:proofErr w:type="spellStart"/>
+      <w:r>
+        <w:rPr>
+          <w:rFonts w:ascii="Times New Roman" w:hAnsi="Times New Roman"/>
+          <w:sz w:val="24"/>
+          <w:szCs w:val="24"/>
+          <w:lang w:val="en-US"/>
+        </w:rPr>
+        <w:t>nama_direktur</w:t>
+      </w:r>
+      <w:proofErr w:type="spellEnd"/>
+      <w:r>
+        <w:rPr>
+          <w:rFonts w:ascii="Times New Roman" w:hAnsi="Times New Roman"/>
+          <w:sz w:val="24"/>
+          <w:szCs w:val="24"/>
+          <w:lang w:val="en-US"/>
+        </w:rPr>
+        <w:t>}</w:t>
       </w:r>
     </w:p>
     <w:p>
       <w:pPr>
         <w:spacing w:after="0" w:line="360" w:lineRule="auto"/>
-        <w:ind w:left="284"/>
+        <w:ind w:left="3544" w:right="709" w:hanging="2977"/>
         <w:jc w:val="both"/>
         <w:rPr>
           <w:rFonts w:ascii="Times New Roman" w:hAnsi="Times New Roman"/>
@@ -290,32 +355,65 @@
           <w:szCs w:val="24"/>
         </w:rPr>
         <w:tab/>
-      </w:r>
-      <w:r>
-        <w:rPr>
-          <w:rFonts w:ascii="Times New Roman" w:hAnsi="Times New Roman"/>
-          <w:sz w:val="24"/>
-          <w:szCs w:val="24"/>
-        </w:rPr>
-        <w:tab/>
-      </w:r>
-      <w:r>
-        <w:rPr>
-          <w:rFonts w:ascii="Times New Roman" w:hAnsi="Times New Roman"/>
-          <w:sz w:val="24"/>
-          <w:szCs w:val="24"/>
-        </w:rPr>
-        <w:tab/>
-        <w:t>: Direktur Utama Rumah Sakit PKU Muhammadiyah Sukoharjo</w:t>
+        <w:t xml:space="preserve">: </w:t>
+      </w:r>
+      <w:r>
+        <w:rPr>
+          <w:rFonts w:ascii="Times New Roman" w:hAnsi="Times New Roman"/>
+          <w:sz w:val="24"/>
+          <w:szCs w:val="24"/>
+          <w:lang w:val="en-US"/>
+        </w:rPr>
+        <w:t>${</w:t>
+      </w:r>
+      <w:proofErr w:type="spellStart"/>
+      <w:r>
+        <w:rPr>
+          <w:rFonts w:ascii="Times New Roman" w:hAnsi="Times New Roman"/>
+          <w:sz w:val="24"/>
+          <w:szCs w:val="24"/>
+          <w:lang w:val="en-US"/>
+        </w:rPr>
+        <w:t>jabatan_direktur</w:t>
+      </w:r>
+      <w:proofErr w:type="spellEnd"/>
+      <w:r>
+        <w:rPr>
+          <w:rFonts w:ascii="Times New Roman" w:hAnsi="Times New Roman"/>
+          <w:sz w:val="24"/>
+          <w:szCs w:val="24"/>
+          <w:lang w:val="en-US"/>
+        </w:rPr>
+        <w:t>} ${</w:t>
+      </w:r>
+      <w:proofErr w:type="spellStart"/>
+      <w:r>
+        <w:rPr>
+          <w:rFonts w:ascii="Times New Roman" w:hAnsi="Times New Roman"/>
+          <w:sz w:val="24"/>
+          <w:szCs w:val="24"/>
+          <w:lang w:val="en-US"/>
+        </w:rPr>
+        <w:t>nama_rs</w:t>
+      </w:r>
+      <w:proofErr w:type="spellEnd"/>
+      <w:r>
+        <w:rPr>
+          <w:rFonts w:ascii="Times New Roman" w:hAnsi="Times New Roman"/>
+          <w:sz w:val="24"/>
+          <w:szCs w:val="24"/>
+          <w:lang w:val="en-US"/>
+        </w:rPr>
+        <w:t>}</w:t>
       </w:r>
     </w:p>
     <w:p>
       <w:pPr>
         <w:tabs>
-          <w:tab w:val="left" w:pos="567"/>
+          <w:tab w:val="left" w:pos="3544"/>
         </w:tabs>
         <w:spacing w:after="0" w:line="360" w:lineRule="auto"/>
-        <w:ind w:left="284"/>
+        <w:ind w:left="3544" w:right="709" w:hanging="2977"/>
         <w:jc w:val="both"/>
         <w:rPr>
           <w:rFonts w:ascii="Times New Roman" w:hAnsi="Times New Roman"/>
@@ -346,6 +444,70 @@
           <w:szCs w:val="24"/>
         </w:rPr>
         <w:tab/>
+        <w:t xml:space="preserve">: </w:t>
+      </w:r>
+      <w:r>
+        <w:rPr>
+          <w:rFonts w:ascii="Times New Roman" w:hAnsi="Times New Roman"/>
+          <w:sz w:val="24"/>
+          <w:szCs w:val="24"/>
+          <w:lang w:val="en-US"/>
+        </w:rPr>
+        <w:t>${</w:t>
+      </w:r>
+      <w:proofErr w:type="spellStart"/>
+      <w:r>
+        <w:rPr>
+          <w:rFonts w:ascii="Times New Roman" w:hAnsi="Times New Roman"/>
+          <w:sz w:val="24"/>
+          <w:szCs w:val="24"/>
+          <w:lang w:val="en-US"/>
+        </w:rPr>
+        <w:t>a</w:t>
+      </w:r>
+      <w:r>
+        <w:rPr>
+          <w:rFonts w:ascii="Times New Roman" w:hAnsi="Times New Roman"/>
+          <w:sz w:val="24"/>
+          <w:szCs w:val="24"/>
+          <w:lang w:val="en-US"/>
+        </w:rPr>
+        <w:t>lamat_rs</w:t>
+      </w:r>
+      <w:proofErr w:type="spellEnd"/>
+      <w:r>
+        <w:rPr>
+          <w:rFonts w:ascii="Times New Roman" w:hAnsi="Times New Roman"/>
+          <w:sz w:val="24"/>
+          <w:szCs w:val="24"/>
+          <w:lang w:val="en-US"/>
+        </w:rPr>
+        <w:t>}</w:t>
+      </w:r>
+      <w:bookmarkStart w:id="2" w:name="_Hlk188013061"/>
+    </w:p>
+    <w:bookmarkEnd w:id="1"/>
+    <w:p>
+      <w:pPr>
+        <w:tabs>
+          <w:tab w:val="left" w:pos="3544"/>
+        </w:tabs>
+        <w:spacing w:after="0" w:line="360" w:lineRule="auto"/>
+        <w:ind w:left="567" w:right="709"/>
+        <w:jc w:val="both"/>
+        <w:rPr>
+          <w:rFonts w:ascii="Times New Roman" w:hAnsi="Times New Roman"/>
+          <w:sz w:val="24"/>
+          <w:szCs w:val="24"/>
+        </w:rPr>
+      </w:pPr>
+      <w:r>
+        <w:rPr>
+          <w:rFonts w:ascii="Times New Roman" w:hAnsi="Times New Roman"/>
+          <w:sz w:val="24"/>
+          <w:szCs w:val="24"/>
+        </w:rPr>
+        <w:t>Menerangkan bahwa</w:t>
       </w:r>
       <w:r>
         <w:rPr>
@@ -362,13 +524,16 @@
           <w:szCs w:val="24"/>
         </w:rPr>
         <w:tab/>
-        <w:t>: Jl. Mayor Sunaryo No. 37, Sukoharjo</w:t>
+        <w:t>:</w:t>
       </w:r>
     </w:p>
     <w:p>
       <w:pPr>
+        <w:tabs>
+          <w:tab w:val="left" w:pos="3544"/>
+        </w:tabs>
         <w:spacing w:after="0" w:line="360" w:lineRule="auto"/>
-        <w:ind w:left="284"/>
+        <w:ind w:left="3544" w:right="709" w:hanging="2693"/>
         <w:jc w:val="both"/>
         <w:rPr>
           <w:rFonts w:ascii="Times New Roman" w:hAnsi="Times New Roman"/>
@@ -382,7 +547,7 @@
           <w:sz w:val="24"/>
           <w:szCs w:val="24"/>
         </w:rPr>
-        <w:t>Menerangkan bahwa</w:t>
+        <w:t>Nama</w:t>
       </w:r>
       <w:r>
         <w:rPr>
@@ -399,11 +564,45 @@
           <w:szCs w:val="24"/>
         </w:rPr>
         <w:tab/>
-        <w:t>:</w:t>
+        <w:t xml:space="preserve">: </w:t>
+      </w:r>
+      <w:r>
+        <w:rPr>
+          <w:rFonts w:ascii="Times New Roman" w:hAnsi="Times New Roman"/>
+          <w:sz w:val="24"/>
+          <w:szCs w:val="24"/>
+          <w:lang w:val="en-US"/>
+        </w:rPr>
+        <w:t>${</w:t>
+      </w:r>
+      <w:proofErr w:type="spellStart"/>
+      <w:r>
+        <w:rPr>
+          <w:rFonts w:ascii="Times New Roman" w:hAnsi="Times New Roman"/>
+          <w:sz w:val="24"/>
+          <w:szCs w:val="24"/>
+          <w:lang w:val="en-US"/>
+        </w:rPr>
+        <w:t>pegawai_nama</w:t>
+      </w:r>
+      <w:proofErr w:type="spellEnd"/>
+      <w:r>
+        <w:rPr>
+          <w:rFonts w:ascii="Times New Roman" w:hAnsi="Times New Roman"/>
+          <w:sz w:val="24"/>
+          <w:szCs w:val="24"/>
+          <w:lang w:val="en-US"/>
+        </w:rPr>
+        <w:t>}</w:t>
       </w:r>
     </w:p>
     <w:p>
       <w:pPr>
+        <w:tabs>
+          <w:tab w:val="left" w:pos="3544"/>
+        </w:tabs>
+        <w:spacing w:after="0" w:line="360" w:lineRule="auto"/>
+        <w:ind w:left="3544" w:right="709" w:hanging="2693"/>
         <w:jc w:val="both"/>
         <w:rPr>
           <w:rFonts w:ascii="Times New Roman" w:hAnsi="Times New Roman"/>
@@ -417,24 +616,7 @@
           <w:sz w:val="24"/>
           <w:szCs w:val="24"/>
         </w:rPr>
-        <w:t xml:space="preserve">   </w:t>
-      </w:r>
-      <w:r>
-        <w:rPr>
-          <w:rFonts w:ascii="Times New Roman" w:hAnsi="Times New Roman"/>
-          <w:sz w:val="24"/>
-          <w:szCs w:val="24"/>
-          <w:lang w:val="en-US"/>
-        </w:rPr>
-        <w:t xml:space="preserve">     </w:t>
-      </w:r>
-      <w:r>
-        <w:rPr>
-          <w:rFonts w:ascii="Times New Roman" w:hAnsi="Times New Roman"/>
-          <w:sz w:val="24"/>
-          <w:szCs w:val="24"/>
-        </w:rPr>
-        <w:t xml:space="preserve">Nama </w:t>
+        <w:t>Tempat Tgl. Lahir</w:t>
       </w:r>
       <w:r>
         <w:rPr>
@@ -451,27 +633,42 @@
           <w:szCs w:val="24"/>
         </w:rPr>
         <w:tab/>
-      </w:r>
-      <w:r>
-        <w:rPr>
-          <w:rFonts w:ascii="Times New Roman" w:hAnsi="Times New Roman"/>
-          <w:sz w:val="24"/>
-          <w:szCs w:val="24"/>
-        </w:rPr>
-        <w:tab/>
-      </w:r>
-      <w:r>
-        <w:rPr>
-          <w:rFonts w:ascii="Times New Roman" w:hAnsi="Times New Roman"/>
-          <w:sz w:val="24"/>
-          <w:szCs w:val="24"/>
-        </w:rPr>
-        <w:tab/>
-        <w:t>: Yunita Eka Pratiwi, A.Md. Kep</w:t>
+        <w:t xml:space="preserve">: </w:t>
+      </w:r>
+      <w:r>
+        <w:rPr>
+          <w:rFonts w:ascii="Times New Roman" w:hAnsi="Times New Roman"/>
+          <w:sz w:val="24"/>
+          <w:szCs w:val="24"/>
+          <w:lang w:val="en-US"/>
+        </w:rPr>
+        <w:t>${</w:t>
+      </w:r>
+      <w:proofErr w:type="spellStart"/>
+      <w:r>
+        <w:rPr>
+          <w:rFonts w:ascii="Times New Roman" w:hAnsi="Times New Roman"/>
+          <w:sz w:val="24"/>
+          <w:szCs w:val="24"/>
+          <w:lang w:val="en-US"/>
+        </w:rPr>
+        <w:t>pegawai_ttl</w:t>
+      </w:r>
+      <w:proofErr w:type="spellEnd"/>
+      <w:r>
+        <w:rPr>
+          <w:rFonts w:ascii="Times New Roman" w:hAnsi="Times New Roman"/>
+          <w:sz w:val="24"/>
+          <w:szCs w:val="24"/>
+          <w:lang w:val="en-US"/>
+        </w:rPr>
+        <w:t>}</w:t>
       </w:r>
     </w:p>
     <w:p>
       <w:pPr>
+        <w:spacing w:after="0" w:line="360" w:lineRule="auto"/>
+        <w:ind w:left="3544" w:right="709" w:hanging="2693"/>
         <w:jc w:val="both"/>
         <w:rPr>
           <w:rFonts w:ascii="Times New Roman" w:hAnsi="Times New Roman"/>
@@ -481,28 +678,11 @@
       </w:pPr>
       <w:r>
         <w:rPr>
-          <w:rFonts w:ascii="Times New Roman" w:eastAsia="Times New Roman" w:hAnsi="Times New Roman" w:cs="Times New Roman"/>
-          <w:sz w:val="24"/>
-          <w:szCs w:val="24"/>
-          <w:lang w:val="en-ID" w:eastAsia="en-ID"/>
-        </w:rPr>
-        <w:t xml:space="preserve">       </w:t>
-      </w:r>
-      <w:r>
-        <w:rPr>
-          <w:rFonts w:ascii="Times New Roman" w:hAnsi="Times New Roman"/>
-          <w:sz w:val="24"/>
-          <w:szCs w:val="24"/>
-        </w:rPr>
-        <w:t>Tempat Tgl. lahir</w:t>
-      </w:r>
-      <w:r>
-        <w:rPr>
-          <w:rFonts w:ascii="Times New Roman" w:hAnsi="Times New Roman"/>
-          <w:sz w:val="24"/>
-          <w:szCs w:val="24"/>
-        </w:rPr>
-        <w:tab/>
+          <w:rFonts w:ascii="Times New Roman" w:hAnsi="Times New Roman"/>
+          <w:sz w:val="24"/>
+          <w:szCs w:val="24"/>
+        </w:rPr>
+        <w:t xml:space="preserve">Pendidikan </w:t>
       </w:r>
       <w:r>
         <w:rPr>
@@ -526,44 +706,49 @@
           <w:rFonts w:ascii="Times New Roman" w:hAnsi="Times New Roman"/>
           <w:sz w:val="24"/>
           <w:szCs w:val="24"/>
-        </w:rPr>
-        <w:t>Sukoharjo, 11 Juni 1991</w:t>
+          <w:lang w:val="en-US"/>
+        </w:rPr>
+        <w:t>${</w:t>
+      </w:r>
+      <w:proofErr w:type="spellStart"/>
+      <w:r>
+        <w:rPr>
+          <w:rFonts w:ascii="Times New Roman" w:hAnsi="Times New Roman"/>
+          <w:sz w:val="24"/>
+          <w:szCs w:val="24"/>
+          <w:lang w:val="en-US"/>
+        </w:rPr>
+        <w:t>pegawai_pendidikan</w:t>
+      </w:r>
+      <w:proofErr w:type="spellEnd"/>
+      <w:r>
+        <w:rPr>
+          <w:rFonts w:ascii="Times New Roman" w:hAnsi="Times New Roman"/>
+          <w:sz w:val="24"/>
+          <w:szCs w:val="24"/>
+          <w:lang w:val="en-US"/>
+        </w:rPr>
+        <w:t>}</w:t>
       </w:r>
     </w:p>
     <w:p>
       <w:pPr>
+        <w:spacing w:after="120" w:line="360" w:lineRule="auto"/>
+        <w:ind w:left="3544" w:right="709" w:hanging="2693"/>
         <w:jc w:val="both"/>
         <w:rPr>
-          <w:rFonts w:ascii="Times New Roman" w:eastAsia="Times New Roman" w:hAnsi="Times New Roman" w:cs="Times New Roman"/>
-          <w:sz w:val="24"/>
-          <w:szCs w:val="24"/>
-          <w:lang w:eastAsia="en-ID"/>
-        </w:rPr>
-      </w:pPr>
-      <w:r>
-        <w:rPr>
-          <w:rFonts w:ascii="Times New Roman" w:hAnsi="Times New Roman"/>
-          <w:sz w:val="24"/>
-          <w:szCs w:val="24"/>
-        </w:rPr>
-        <w:t xml:space="preserve">    </w:t>
-      </w:r>
-      <w:r>
-        <w:rPr>
-          <w:rFonts w:ascii="Times New Roman" w:hAnsi="Times New Roman"/>
-          <w:sz w:val="24"/>
-          <w:szCs w:val="24"/>
-          <w:lang w:val="en-US"/>
-        </w:rPr>
-        <w:t xml:space="preserve">   </w:t>
-      </w:r>
-      <w:r>
-        <w:rPr>
-          <w:rFonts w:ascii="Times New Roman" w:hAnsi="Times New Roman"/>
-          <w:sz w:val="24"/>
-          <w:szCs w:val="24"/>
-        </w:rPr>
-        <w:t xml:space="preserve">Pendidikan </w:t>
+          <w:rFonts w:ascii="Times New Roman" w:hAnsi="Times New Roman"/>
+          <w:sz w:val="24"/>
+          <w:szCs w:val="24"/>
+        </w:rPr>
+      </w:pPr>
+      <w:r>
+        <w:rPr>
+          <w:rFonts w:ascii="Times New Roman" w:hAnsi="Times New Roman"/>
+          <w:sz w:val="24"/>
+          <w:szCs w:val="24"/>
+        </w:rPr>
+        <w:t>Alamat</w:t>
       </w:r>
       <w:r>
         <w:rPr>
@@ -578,152 +763,60 @@
           <w:rFonts w:ascii="Times New Roman" w:hAnsi="Times New Roman"/>
           <w:sz w:val="24"/>
           <w:szCs w:val="24"/>
-        </w:rPr>
-        <w:tab/>
-      </w:r>
-      <w:r>
-        <w:rPr>
-          <w:rFonts w:ascii="Times New Roman" w:hAnsi="Times New Roman"/>
-          <w:sz w:val="24"/>
-          <w:szCs w:val="24"/>
-        </w:rPr>
-        <w:tab/>
-        <w:t>: Diploma III - Keperawatan</w:t>
+          <w:lang w:val="en-US"/>
+        </w:rPr>
+        <w:t xml:space="preserve"> </w:t>
+      </w:r>
+      <w:r>
+        <w:rPr>
+          <w:rFonts w:ascii="Times New Roman" w:hAnsi="Times New Roman"/>
+          <w:sz w:val="24"/>
+          <w:szCs w:val="24"/>
+        </w:rPr>
+        <w:t xml:space="preserve">: </w:t>
+      </w:r>
+      <w:r>
+        <w:rPr>
+          <w:rFonts w:ascii="Times New Roman" w:hAnsi="Times New Roman"/>
+          <w:sz w:val="24"/>
+          <w:szCs w:val="24"/>
+          <w:lang w:val="en-US"/>
+        </w:rPr>
+        <w:t>${</w:t>
+      </w:r>
+      <w:proofErr w:type="spellStart"/>
+      <w:r>
+        <w:rPr>
+          <w:rFonts w:ascii="Times New Roman" w:hAnsi="Times New Roman"/>
+          <w:sz w:val="24"/>
+          <w:szCs w:val="24"/>
+          <w:lang w:val="en-US"/>
+        </w:rPr>
+        <w:t>pegawai_alamat</w:t>
+      </w:r>
+      <w:proofErr w:type="spellEnd"/>
+      <w:r>
+        <w:rPr>
+          <w:rFonts w:ascii="Times New Roman" w:hAnsi="Times New Roman"/>
+          <w:sz w:val="24"/>
+          <w:szCs w:val="24"/>
+          <w:lang w:val="en-US"/>
+        </w:rPr>
+        <w:t>}</w:t>
       </w:r>
     </w:p>
+    <w:bookmarkEnd w:id="0"/>
+    <w:bookmarkEnd w:id="2"/>
     <w:p>
       <w:pPr>
+        <w:spacing w:after="120" w:line="360" w:lineRule="auto"/>
+        <w:ind w:left="567" w:right="709"/>
         <w:jc w:val="both"/>
         <w:rPr>
           <w:rFonts w:ascii="Times New Roman" w:hAnsi="Times New Roman"/>
           <w:sz w:val="24"/>
           <w:szCs w:val="24"/>
-        </w:rPr>
-      </w:pPr>
-      <w:r>
-        <w:rPr>
-          <w:rFonts w:ascii="Times New Roman" w:hAnsi="Times New Roman"/>
-          <w:sz w:val="24"/>
-          <w:szCs w:val="24"/>
-        </w:rPr>
-        <w:t xml:space="preserve">  </w:t>
-      </w:r>
-      <w:r>
-        <w:rPr>
-          <w:rFonts w:ascii="Times New Roman" w:hAnsi="Times New Roman"/>
-          <w:sz w:val="24"/>
-          <w:szCs w:val="24"/>
-          <w:lang w:val="en-US"/>
-        </w:rPr>
-        <w:t xml:space="preserve">     </w:t>
-      </w:r>
-      <w:r>
-        <w:rPr>
-          <w:rFonts w:ascii="Times New Roman" w:hAnsi="Times New Roman"/>
-          <w:sz w:val="24"/>
-          <w:szCs w:val="24"/>
-        </w:rPr>
-        <w:t xml:space="preserve">Alamat       </w:t>
-      </w:r>
-      <w:r>
-        <w:rPr>
-          <w:rFonts w:ascii="Times New Roman" w:hAnsi="Times New Roman"/>
-          <w:sz w:val="24"/>
-          <w:szCs w:val="24"/>
-        </w:rPr>
-        <w:tab/>
-      </w:r>
-      <w:r>
-        <w:rPr>
-          <w:rFonts w:ascii="Times New Roman" w:hAnsi="Times New Roman"/>
-          <w:sz w:val="24"/>
-          <w:szCs w:val="24"/>
-        </w:rPr>
-        <w:tab/>
-      </w:r>
-      <w:r>
-        <w:rPr>
-          <w:rFonts w:ascii="Times New Roman" w:hAnsi="Times New Roman"/>
-          <w:sz w:val="24"/>
-          <w:szCs w:val="24"/>
-        </w:rPr>
-        <w:tab/>
-        <w:t xml:space="preserve">: </w:t>
-      </w:r>
-      <w:r>
-        <w:rPr>
-          <w:rFonts w:ascii="Times New Roman" w:hAnsi="Times New Roman"/>
-          <w:sz w:val="24"/>
-          <w:szCs w:val="24"/>
-        </w:rPr>
-        <w:t xml:space="preserve">Wotgaleh, RT </w:t>
-      </w:r>
-      <w:r>
-        <w:rPr>
-          <w:rFonts w:ascii="Times New Roman" w:hAnsi="Times New Roman"/>
-          <w:sz w:val="24"/>
-          <w:szCs w:val="24"/>
-        </w:rPr>
-        <w:t>0</w:t>
-      </w:r>
-      <w:r>
-        <w:rPr>
-          <w:rFonts w:ascii="Times New Roman" w:hAnsi="Times New Roman"/>
-          <w:sz w:val="24"/>
-          <w:szCs w:val="24"/>
-        </w:rPr>
-        <w:t>01 / R</w:t>
-      </w:r>
-      <w:r>
-        <w:rPr>
-          <w:rFonts w:ascii="Times New Roman" w:hAnsi="Times New Roman"/>
-          <w:sz w:val="24"/>
-          <w:szCs w:val="24"/>
-        </w:rPr>
-        <w:t>W</w:t>
-      </w:r>
-      <w:r>
-        <w:rPr>
-          <w:rFonts w:ascii="Times New Roman" w:hAnsi="Times New Roman"/>
-          <w:sz w:val="24"/>
-          <w:szCs w:val="24"/>
-        </w:rPr>
-        <w:t xml:space="preserve"> </w:t>
-      </w:r>
-      <w:r>
-        <w:rPr>
-          <w:rFonts w:ascii="Times New Roman" w:hAnsi="Times New Roman"/>
-          <w:sz w:val="24"/>
-          <w:szCs w:val="24"/>
-        </w:rPr>
-        <w:t>0</w:t>
-      </w:r>
-      <w:r>
-        <w:rPr>
-          <w:rFonts w:ascii="Times New Roman" w:hAnsi="Times New Roman"/>
-          <w:sz w:val="24"/>
-          <w:szCs w:val="24"/>
-        </w:rPr>
-        <w:t>09, Sukoharjo</w:t>
-      </w:r>
-      <w:r>
-        <w:rPr>
-          <w:rFonts w:ascii="Times New Roman" w:hAnsi="Times New Roman"/>
-          <w:sz w:val="24"/>
-          <w:szCs w:val="24"/>
-        </w:rPr>
-        <w:t>, Sukoharjo</w:t>
-      </w:r>
-    </w:p>
-    <w:p>
-      <w:pPr>
-        <w:ind w:left="284"/>
-        <w:jc w:val="both"/>
-        <w:rPr>
-          <w:rFonts w:ascii="Times New Roman" w:eastAsia="Times New Roman" w:hAnsi="Times New Roman" w:cs="Times New Roman"/>
-          <w:sz w:val="24"/>
-          <w:szCs w:val="24"/>
-          <w:lang w:val="en-ID" w:eastAsia="en-ID"/>
+          <w:lang w:val="en-US"/>
         </w:rPr>
       </w:pPr>
       <w:r>
@@ -738,59 +831,14 @@
       </w:r>
       <w:r>
         <w:rPr>
-          <w:rFonts w:ascii="Times New Roman" w:eastAsia="Times New Roman" w:hAnsi="Times New Roman" w:cs="Times New Roman"/>
-          <w:sz w:val="24"/>
-          <w:szCs w:val="24"/>
-          <w:lang w:eastAsia="en-ID"/>
-        </w:rPr>
-        <w:t>Perawat</w:t>
-      </w:r>
-      <w:r>
-        <w:rPr>
-          <w:rFonts w:ascii="Times New Roman" w:eastAsia="Times New Roman" w:hAnsi="Times New Roman" w:cs="Times New Roman"/>
-          <w:sz w:val="24"/>
-          <w:szCs w:val="24"/>
-          <w:lang w:val="en-ID" w:eastAsia="en-ID"/>
-        </w:rPr>
-        <w:t xml:space="preserve"> </w:t>
-      </w:r>
-      <w:r>
-        <w:rPr>
           <w:rFonts w:ascii="Times New Roman" w:hAnsi="Times New Roman" w:cs="Times New Roman"/>
           <w:iCs/>
           <w:color w:val="0D0D0D" w:themeColor="text1" w:themeTint="F2"/>
           <w:sz w:val="24"/>
           <w:szCs w:val="24"/>
-        </w:rPr>
-        <w:t xml:space="preserve">Rumah Sakit PKU Muhammadiyah Sukoharjo terhitung mulai </w:t>
-      </w:r>
-      <w:r>
-        <w:rPr>
-          <w:rFonts w:ascii="Times New Roman" w:hAnsi="Times New Roman" w:cs="Times New Roman"/>
-          <w:iCs/>
-          <w:sz w:val="24"/>
-          <w:szCs w:val="24"/>
-        </w:rPr>
-        <w:t xml:space="preserve">tanggal </w:t>
-      </w:r>
-      <w:r>
-        <w:rPr>
-          <w:rFonts w:ascii="Times New Roman" w:hAnsi="Times New Roman" w:cs="Times New Roman"/>
-          <w:iCs/>
-          <w:sz w:val="24"/>
-          <w:szCs w:val="24"/>
-        </w:rPr>
-        <w:t>10 Juni 2023 – 11 Juni 2024</w:t>
-      </w:r>
-      <w:r>
-        <w:rPr>
-          <w:rFonts w:ascii="Times New Roman" w:hAnsi="Times New Roman" w:cs="Times New Roman"/>
-          <w:iCs/>
-          <w:sz w:val="24"/>
-          <w:szCs w:val="24"/>
-          <w:lang w:val="en-US"/>
-        </w:rPr>
-        <w:t xml:space="preserve"> </w:t>
+          <w:lang w:val="en-US"/>
+        </w:rPr>
+        <w:t>${</w:t>
       </w:r>
       <w:proofErr w:type="spellStart"/>
       <w:r>
@@ -802,7 +850,7 @@
           <w:szCs w:val="24"/>
           <w:lang w:val="en-US"/>
         </w:rPr>
-        <w:t>dengan</w:t>
+        <w:t>profesi</w:t>
       </w:r>
       <w:proofErr w:type="spellEnd"/>
       <w:r>
@@ -814,9 +862,8 @@
           <w:szCs w:val="24"/>
           <w:lang w:val="en-US"/>
         </w:rPr>
-        <w:t xml:space="preserve"> </w:t>
-      </w:r>
-      <w:proofErr w:type="spellStart"/>
+        <w:t xml:space="preserve">} </w:t>
+      </w:r>
       <w:r>
         <w:rPr>
           <w:rFonts w:ascii="Times New Roman" w:hAnsi="Times New Roman" w:cs="Times New Roman"/>
@@ -824,11 +871,38 @@
           <w:color w:val="0D0D0D" w:themeColor="text1" w:themeTint="F2"/>
           <w:sz w:val="24"/>
           <w:szCs w:val="24"/>
-          <w:lang w:val="en-US"/>
-        </w:rPr>
-        <w:t>kinerja</w:t>
+        </w:rPr>
+        <w:t xml:space="preserve">Rumah Sakit PKU Muhammadiyah Sukoharjo terhitung mulai tanggal </w:t>
+      </w:r>
+      <w:r>
+        <w:rPr>
+          <w:rFonts w:ascii="Times New Roman" w:hAnsi="Times New Roman"/>
+          <w:sz w:val="24"/>
+          <w:szCs w:val="24"/>
+          <w:lang w:val="en-US"/>
+        </w:rPr>
+        <w:t>${</w:t>
+      </w:r>
+      <w:proofErr w:type="spellStart"/>
+      <w:r>
+        <w:rPr>
+          <w:rFonts w:ascii="Times New Roman" w:hAnsi="Times New Roman"/>
+          <w:sz w:val="24"/>
+          <w:szCs w:val="24"/>
+          <w:lang w:val="en-US"/>
+        </w:rPr>
+        <w:t>pegawai_tmt</w:t>
       </w:r>
       <w:proofErr w:type="spellEnd"/>
+      <w:r>
+        <w:rPr>
+          <w:rFonts w:ascii="Times New Roman" w:hAnsi="Times New Roman"/>
+          <w:sz w:val="24"/>
+          <w:szCs w:val="24"/>
+          <w:lang w:val="en-US"/>
+        </w:rPr>
+        <w:t>}</w:t>
+      </w:r>
       <w:r>
         <w:rPr>
           <w:rFonts w:ascii="Times New Roman" w:hAnsi="Times New Roman" w:cs="Times New Roman"/>
@@ -838,9 +912,8 @@
           <w:szCs w:val="24"/>
           <w:lang w:val="en-US"/>
         </w:rPr>
-        <w:t xml:space="preserve"> yang </w:t>
-      </w:r>
-      <w:proofErr w:type="spellStart"/>
+        <w:t xml:space="preserve"> </w:t>
+      </w:r>
       <w:r>
         <w:rPr>
           <w:rFonts w:ascii="Times New Roman" w:hAnsi="Times New Roman" w:cs="Times New Roman"/>
@@ -848,11 +921,9 @@
           <w:color w:val="0D0D0D" w:themeColor="text1" w:themeTint="F2"/>
           <w:sz w:val="24"/>
           <w:szCs w:val="24"/>
-          <w:lang w:val="en-US"/>
-        </w:rPr>
-        <w:t>baik</w:t>
-      </w:r>
-      <w:proofErr w:type="spellEnd"/>
+        </w:rPr>
+        <w:t>sampai dengan sekarang</w:t>
+      </w:r>
       <w:r>
         <w:rPr>
           <w:rFonts w:ascii="Times New Roman" w:hAnsi="Times New Roman" w:cs="Times New Roman"/>
@@ -860,8 +931,109 @@
           <w:color w:val="0D0D0D" w:themeColor="text1" w:themeTint="F2"/>
           <w:sz w:val="24"/>
           <w:szCs w:val="24"/>
+          <w:lang w:val="en-US"/>
         </w:rPr>
         <w:t>.</w:t>
+      </w:r>
+    </w:p>
+    <w:p>
+      <w:pPr>
+        <w:spacing w:after="0" w:line="360" w:lineRule="auto"/>
+        <w:ind w:left="567" w:right="709"/>
+        <w:jc w:val="both"/>
+        <w:rPr>
+          <w:rFonts w:ascii="Times New Roman" w:hAnsi="Times New Roman"/>
+          <w:sz w:val="24"/>
+          <w:szCs w:val="24"/>
+        </w:rPr>
+      </w:pPr>
+      <w:r>
+        <w:rPr>
+          <w:rFonts w:ascii="Times New Roman" w:hAnsi="Times New Roman" w:cs="Times New Roman"/>
+          <w:iCs/>
+          <w:color w:val="0D0D0D" w:themeColor="text1" w:themeTint="F2"/>
+          <w:sz w:val="24"/>
+          <w:szCs w:val="24"/>
+        </w:rPr>
+        <w:t xml:space="preserve">Demikian surat keterangan ini dibuat guna </w:t>
+      </w:r>
+      <w:r>
+        <w:rPr>
+          <w:rFonts w:ascii="Times New Roman" w:hAnsi="Times New Roman" w:cs="Times New Roman"/>
+          <w:iCs/>
+          <w:color w:val="0D0D0D" w:themeColor="text1" w:themeTint="F2"/>
+          <w:sz w:val="24"/>
+          <w:szCs w:val="24"/>
+        </w:rPr>
+        <w:t>mengurus</w:t>
+      </w:r>
+      <w:r>
+        <w:rPr>
+          <w:rFonts w:ascii="Times New Roman" w:hAnsi="Times New Roman" w:cs="Times New Roman"/>
+          <w:iCs/>
+          <w:color w:val="0D0D0D" w:themeColor="text1" w:themeTint="F2"/>
+          <w:sz w:val="24"/>
+          <w:szCs w:val="24"/>
+        </w:rPr>
+        <w:t xml:space="preserve"> Surat Tanda Registrasi</w:t>
+      </w:r>
+      <w:r>
+        <w:rPr>
+          <w:rFonts w:ascii="Times New Roman" w:hAnsi="Times New Roman" w:cs="Times New Roman"/>
+          <w:iCs/>
+          <w:color w:val="0D0D0D" w:themeColor="text1" w:themeTint="F2"/>
+          <w:sz w:val="24"/>
+          <w:szCs w:val="24"/>
+        </w:rPr>
+        <w:t xml:space="preserve"> </w:t>
+      </w:r>
+      <w:r>
+        <w:rPr>
+          <w:rFonts w:ascii="Times New Roman" w:hAnsi="Times New Roman" w:cs="Times New Roman"/>
+          <w:iCs/>
+          <w:color w:val="0D0D0D" w:themeColor="text1" w:themeTint="F2"/>
+          <w:sz w:val="24"/>
+          <w:szCs w:val="24"/>
+        </w:rPr>
+        <w:t>(</w:t>
+      </w:r>
+      <w:r>
+        <w:rPr>
+          <w:rFonts w:ascii="Times New Roman" w:hAnsi="Times New Roman" w:cs="Times New Roman"/>
+          <w:iCs/>
+          <w:color w:val="0D0D0D" w:themeColor="text1" w:themeTint="F2"/>
+          <w:sz w:val="24"/>
+          <w:szCs w:val="24"/>
+        </w:rPr>
+        <w:t>STR</w:t>
+      </w:r>
+      <w:r>
+        <w:rPr>
+          <w:rFonts w:ascii="Times New Roman" w:hAnsi="Times New Roman" w:cs="Times New Roman"/>
+          <w:iCs/>
+          <w:color w:val="0D0D0D" w:themeColor="text1" w:themeTint="F2"/>
+          <w:sz w:val="24"/>
+          <w:szCs w:val="24"/>
+        </w:rPr>
+        <w:t>)</w:t>
+      </w:r>
+      <w:r>
+        <w:rPr>
+          <w:rFonts w:ascii="Times New Roman" w:hAnsi="Times New Roman" w:cs="Times New Roman"/>
+          <w:iCs/>
+          <w:color w:val="0D0D0D" w:themeColor="text1" w:themeTint="F2"/>
+          <w:sz w:val="24"/>
+          <w:szCs w:val="24"/>
+        </w:rPr>
+        <w:t xml:space="preserve"> dan dapat dipergunakan sebagaimana mestinya.  </w:t>
+      </w:r>
+      <w:r>
+        <w:rPr>
+          <w:rFonts w:ascii="Times New Roman" w:hAnsi="Times New Roman"/>
+          <w:sz w:val="24"/>
+          <w:szCs w:val="24"/>
+        </w:rPr>
+        <w:t xml:space="preserve">  </w:t>
       </w:r>
     </w:p>
     <w:p>
@@ -883,150 +1055,167 @@
           <w:sz w:val="24"/>
           <w:szCs w:val="24"/>
         </w:rPr>
-        <w:t xml:space="preserve">Demikian surat keterangan ini dibuat untuk </w:t>
-      </w:r>
-      <w:r>
-        <w:rPr>
-          <w:rFonts w:ascii="Times New Roman" w:hAnsi="Times New Roman" w:cs="Times New Roman"/>
-          <w:iCs/>
-          <w:color w:val="0D0D0D" w:themeColor="text1" w:themeTint="F2"/>
-          <w:sz w:val="24"/>
-          <w:szCs w:val="24"/>
-          <w:highlight w:val="yellow"/>
-        </w:rPr>
-        <w:t>pemenuhan jumlah Satuan Kredit Profesi (SKP)</w:t>
-      </w:r>
-      <w:r>
-        <w:rPr>
-          <w:rFonts w:ascii="Times New Roman" w:hAnsi="Times New Roman" w:cs="Times New Roman"/>
-          <w:iCs/>
-          <w:color w:val="0D0D0D" w:themeColor="text1" w:themeTint="F2"/>
-          <w:sz w:val="24"/>
-          <w:szCs w:val="24"/>
-        </w:rPr>
-        <w:t xml:space="preserve"> dapat dipergunakan sebagaimana mestinya.  </w:t>
-      </w:r>
-      <w:r>
-        <w:rPr>
-          <w:rFonts w:ascii="Times New Roman" w:hAnsi="Times New Roman"/>
-          <w:sz w:val="24"/>
-          <w:szCs w:val="24"/>
-        </w:rPr>
         <w:t xml:space="preserve">  </w:t>
       </w:r>
+      <w:r>
+        <w:rPr>
+          <w:rFonts w:ascii="Times New Roman" w:hAnsi="Times New Roman"/>
+          <w:sz w:val="24"/>
+          <w:szCs w:val="24"/>
+        </w:rPr>
+        <w:t xml:space="preserve">  </w:t>
+      </w:r>
+      <w:bookmarkStart w:id="3" w:name="_Hlk188013099"/>
     </w:p>
     <w:p>
       <w:pPr>
-        <w:spacing w:after="0" w:line="360" w:lineRule="auto"/>
-        <w:ind w:left="284" w:right="709"/>
-        <w:jc w:val="both"/>
-        <w:rPr>
-          <w:rFonts w:ascii="Times New Roman" w:hAnsi="Times New Roman" w:cs="Times New Roman"/>
-          <w:iCs/>
-          <w:color w:val="0D0D0D" w:themeColor="text1" w:themeTint="F2"/>
-          <w:sz w:val="24"/>
-          <w:szCs w:val="24"/>
-        </w:rPr>
-      </w:pPr>
+        <w:spacing w:after="0" w:line="240" w:lineRule="auto"/>
+        <w:ind w:left="5529" w:right="709" w:firstLine="284"/>
+        <w:jc w:val="right"/>
+        <w:rPr>
+          <w:rFonts w:ascii="Times New Roman" w:hAnsi="Times New Roman"/>
+          <w:sz w:val="24"/>
+          <w:szCs w:val="24"/>
+          <w:u w:val="single"/>
+        </w:rPr>
+      </w:pPr>
+      <w:r>
+        <w:rPr>
+          <w:rFonts w:ascii="Times New Roman" w:hAnsi="Times New Roman"/>
+          <w:sz w:val="24"/>
+          <w:szCs w:val="24"/>
+        </w:rPr>
+        <w:t xml:space="preserve">Sukoharjo, </w:t>
+      </w:r>
+      <w:r>
+        <w:rPr>
+          <w:rFonts w:ascii="Times New Roman" w:hAnsi="Times New Roman"/>
+          <w:sz w:val="24"/>
+          <w:szCs w:val="24"/>
+          <w:u w:val="single"/>
+          <w:lang w:val="en-US"/>
+        </w:rPr>
+        <w:t>${</w:t>
+      </w:r>
+      <w:proofErr w:type="spellStart"/>
+      <w:r>
+        <w:rPr>
+          <w:rFonts w:ascii="Times New Roman" w:hAnsi="Times New Roman"/>
+          <w:sz w:val="24"/>
+          <w:szCs w:val="24"/>
+          <w:u w:val="single"/>
+          <w:lang w:val="en-US"/>
+        </w:rPr>
+        <w:t>tgl_surat</w:t>
+      </w:r>
+      <w:proofErr w:type="spellEnd"/>
+      <w:r>
+        <w:rPr>
+          <w:rFonts w:ascii="Times New Roman" w:hAnsi="Times New Roman"/>
+          <w:sz w:val="24"/>
+          <w:szCs w:val="24"/>
+          <w:u w:val="single"/>
+          <w:lang w:val="en-US"/>
+        </w:rPr>
+        <w:t>}</w:t>
+      </w:r>
+      <w:r>
+        <w:rPr>
+          <w:rFonts w:ascii="Times New Roman" w:hAnsi="Times New Roman"/>
+          <w:sz w:val="24"/>
+          <w:szCs w:val="24"/>
+          <w:u w:val="single"/>
+        </w:rPr>
+        <w:t xml:space="preserve">     </w:t>
+      </w:r>
+      <w:r>
+        <w:rPr>
+          <w:rFonts w:ascii="Times New Roman" w:hAnsi="Times New Roman"/>
+          <w:sz w:val="24"/>
+          <w:szCs w:val="24"/>
+          <w:u w:val="single"/>
+        </w:rPr>
+        <w:tab/>
+      </w:r>
+      <w:r>
+        <w:rPr>
+          <w:rFonts w:ascii="Times New Roman" w:hAnsi="Times New Roman"/>
+          <w:sz w:val="24"/>
+          <w:szCs w:val="24"/>
+          <w:u w:val="single"/>
+          <w:lang w:val="en-US"/>
+        </w:rPr>
+        <w:t xml:space="preserve">     </w:t>
+      </w:r>
+      <w:r>
+        <w:rPr>
+          <w:rFonts w:ascii="Times New Roman" w:hAnsi="Times New Roman"/>
+          <w:sz w:val="24"/>
+          <w:szCs w:val="24"/>
+          <w:u w:val="single"/>
+          <w:lang w:val="en-US"/>
+        </w:rPr>
+        <w:t>${</w:t>
+      </w:r>
+      <w:proofErr w:type="spellStart"/>
+      <w:r>
+        <w:rPr>
+          <w:rFonts w:ascii="Times New Roman" w:hAnsi="Times New Roman"/>
+          <w:sz w:val="24"/>
+          <w:szCs w:val="24"/>
+          <w:u w:val="single"/>
+          <w:lang w:val="en-US"/>
+        </w:rPr>
+        <w:t>th_surat</w:t>
+      </w:r>
+      <w:proofErr w:type="spellEnd"/>
+      <w:r>
+        <w:rPr>
+          <w:rFonts w:ascii="Times New Roman" w:hAnsi="Times New Roman"/>
+          <w:sz w:val="24"/>
+          <w:szCs w:val="24"/>
+          <w:u w:val="single"/>
+          <w:lang w:val="en-US"/>
+        </w:rPr>
+        <w:t>}</w:t>
+      </w:r>
+      <w:r>
+        <w:rPr>
+          <w:rFonts w:ascii="Times New Roman" w:hAnsi="Times New Roman"/>
+          <w:sz w:val="24"/>
+          <w:szCs w:val="24"/>
+          <w:u w:val="single"/>
+        </w:rPr>
+        <w:t xml:space="preserve"> M</w:t>
+      </w:r>
     </w:p>
     <w:p>
       <w:pPr>
         <w:spacing w:after="0" w:line="240" w:lineRule="auto"/>
-        <w:ind w:left="5387" w:right="-23" w:firstLine="284"/>
-        <w:rPr>
-          <w:rFonts w:ascii="Times New Roman" w:hAnsi="Times New Roman"/>
-          <w:sz w:val="24"/>
-          <w:szCs w:val="24"/>
-        </w:rPr>
-      </w:pPr>
-      <w:r>
-        <w:rPr>
-          <w:rFonts w:ascii="Times New Roman" w:hAnsi="Times New Roman"/>
-          <w:sz w:val="24"/>
-          <w:szCs w:val="24"/>
-        </w:rPr>
-        <w:t xml:space="preserve">Sukoharjo,    </w:t>
-      </w:r>
-      <w:r>
-        <w:rPr>
-          <w:rFonts w:ascii="Times New Roman" w:hAnsi="Times New Roman"/>
-          <w:sz w:val="24"/>
-          <w:szCs w:val="24"/>
-          <w:u w:val="single"/>
-        </w:rPr>
-        <w:t>03 September</w:t>
-      </w:r>
-      <w:r>
-        <w:rPr>
-          <w:rFonts w:ascii="Times New Roman" w:hAnsi="Times New Roman"/>
-          <w:sz w:val="24"/>
-          <w:szCs w:val="24"/>
-          <w:u w:val="single"/>
-        </w:rPr>
-        <w:tab/>
-      </w:r>
-      <w:r>
-        <w:rPr>
-          <w:rFonts w:ascii="Times New Roman" w:hAnsi="Times New Roman"/>
-          <w:sz w:val="24"/>
-          <w:szCs w:val="24"/>
-          <w:u w:val="single"/>
-        </w:rPr>
-        <w:tab/>
-        <w:t>2024 M</w:t>
-      </w:r>
-    </w:p>
-    <w:p>
-      <w:pPr>
-        <w:spacing w:after="0" w:line="240" w:lineRule="auto"/>
-        <w:ind w:left="5670" w:right="-23" w:firstLine="426"/>
-        <w:rPr>
-          <w:rFonts w:ascii="Times New Roman" w:hAnsi="Times New Roman"/>
-          <w:sz w:val="24"/>
-          <w:szCs w:val="24"/>
-        </w:rPr>
-      </w:pPr>
-      <w:r>
-        <w:rPr>
-          <w:rFonts w:ascii="Times New Roman" w:hAnsi="Times New Roman"/>
-          <w:sz w:val="24"/>
-          <w:szCs w:val="24"/>
-        </w:rPr>
-        <w:t xml:space="preserve">      </w:t>
-      </w:r>
-      <w:r>
-        <w:rPr>
-          <w:rFonts w:ascii="Times New Roman" w:hAnsi="Times New Roman"/>
-          <w:sz w:val="24"/>
-          <w:szCs w:val="24"/>
-        </w:rPr>
-        <w:tab/>
-        <w:t xml:space="preserve">        29 Shafar</w:t>
-      </w:r>
-      <w:r>
-        <w:rPr>
-          <w:rFonts w:ascii="Times New Roman" w:hAnsi="Times New Roman"/>
-          <w:sz w:val="24"/>
-          <w:szCs w:val="24"/>
-        </w:rPr>
-        <w:tab/>
-      </w:r>
-      <w:r>
-        <w:rPr>
-          <w:rFonts w:ascii="Times New Roman" w:hAnsi="Times New Roman"/>
-          <w:sz w:val="24"/>
-          <w:szCs w:val="24"/>
-        </w:rPr>
-        <w:tab/>
-      </w:r>
-      <w:r>
-        <w:rPr>
-          <w:rFonts w:ascii="Times New Roman" w:hAnsi="Times New Roman"/>
-          <w:sz w:val="24"/>
-          <w:szCs w:val="24"/>
-        </w:rPr>
-        <w:tab/>
-        <w:t>1446 H</w:t>
+        <w:ind w:left="9360" w:right="567"/>
+        <w:rPr>
+          <w:rFonts w:ascii="Times New Roman" w:hAnsi="Times New Roman"/>
+          <w:sz w:val="24"/>
+          <w:szCs w:val="24"/>
+        </w:rPr>
+      </w:pPr>
+      <w:r>
+        <w:rPr>
+          <w:rFonts w:ascii="Times New Roman" w:hAnsi="Times New Roman"/>
+          <w:sz w:val="24"/>
+          <w:szCs w:val="24"/>
+          <w:lang w:val="en-US"/>
+        </w:rPr>
+        <w:t xml:space="preserve">       </w:t>
+      </w:r>
+      <w:r>
+        <w:rPr>
+          <w:rFonts w:ascii="Times New Roman" w:hAnsi="Times New Roman"/>
+          <w:sz w:val="24"/>
+          <w:szCs w:val="24"/>
+          <w:lang w:val="en-US"/>
+        </w:rPr>
+        <w:t>1445 H</w:t>
       </w:r>
     </w:p>
     <w:p>
@@ -1157,20 +1346,41 @@
           <w:sz w:val="24"/>
           <w:szCs w:val="24"/>
           <w:u w:val="single"/>
-        </w:rPr>
-        <w:t>dr. Indarto, M. Si., M.M</w:t>
+          <w:lang w:val="en-US"/>
+        </w:rPr>
+        <w:t>${</w:t>
+      </w:r>
+      <w:proofErr w:type="spellStart"/>
+      <w:r>
+        <w:rPr>
+          <w:rFonts w:ascii="Times New Roman" w:hAnsi="Times New Roman"/>
+          <w:sz w:val="24"/>
+          <w:szCs w:val="24"/>
+          <w:u w:val="single"/>
+          <w:lang w:val="en-US"/>
+        </w:rPr>
+        <w:t>nama_direktur</w:t>
+      </w:r>
+      <w:proofErr w:type="spellEnd"/>
+      <w:r>
+        <w:rPr>
+          <w:rFonts w:ascii="Times New Roman" w:hAnsi="Times New Roman"/>
+          <w:sz w:val="24"/>
+          <w:szCs w:val="24"/>
+          <w:u w:val="single"/>
+          <w:lang w:val="en-US"/>
+        </w:rPr>
+        <w:t>}</w:t>
       </w:r>
     </w:p>
     <w:p>
       <w:pPr>
-        <w:pStyle w:val="ListParagraph"/>
-        <w:spacing w:line="360" w:lineRule="auto"/>
-        <w:ind w:left="0"/>
-        <w:jc w:val="both"/>
-        <w:rPr>
-          <w:rFonts w:ascii="Times New Roman" w:hAnsi="Times New Roman"/>
-          <w:sz w:val="24"/>
-          <w:szCs w:val="24"/>
+        <w:jc w:val="center"/>
+        <w:rPr>
+          <w:rFonts w:ascii="Times New Roman" w:hAnsi="Times New Roman"/>
+          <w:sz w:val="24"/>
+          <w:szCs w:val="24"/>
+          <w:lang w:val="en-US"/>
         </w:rPr>
       </w:pPr>
       <w:r>
@@ -1244,47 +1454,49 @@
           <w:szCs w:val="24"/>
         </w:rPr>
         <w:tab/>
-      </w:r>
-      <w:r>
-        <w:rPr>
-          <w:rFonts w:ascii="Times New Roman" w:hAnsi="Times New Roman"/>
-          <w:sz w:val="24"/>
-          <w:szCs w:val="24"/>
-        </w:rPr>
-        <w:tab/>
-      </w:r>
-      <w:r>
-        <w:rPr>
-          <w:rFonts w:ascii="Times New Roman" w:hAnsi="Times New Roman"/>
-          <w:sz w:val="24"/>
-          <w:szCs w:val="24"/>
-        </w:rPr>
-        <w:tab/>
-        <w:t xml:space="preserve"> </w:t>
-      </w:r>
-      <w:r>
-        <w:rPr>
-          <w:rFonts w:ascii="Times New Roman" w:hAnsi="Times New Roman"/>
-          <w:sz w:val="24"/>
-          <w:szCs w:val="24"/>
-          <w:lang w:val="en-US"/>
-        </w:rPr>
-        <w:t xml:space="preserve">      </w:t>
-      </w:r>
-      <w:r>
-        <w:rPr>
-          <w:rFonts w:ascii="Times New Roman" w:hAnsi="Times New Roman"/>
-          <w:sz w:val="24"/>
-          <w:szCs w:val="24"/>
-        </w:rPr>
-        <w:t>NBM. 1329060</w:t>
+        <w:t xml:space="preserve">NBM. </w:t>
+      </w:r>
+      <w:r>
+        <w:rPr>
+          <w:rFonts w:ascii="Times New Roman" w:hAnsi="Times New Roman"/>
+          <w:sz w:val="24"/>
+          <w:szCs w:val="24"/>
+          <w:lang w:val="en-US"/>
+        </w:rPr>
+        <w:t>${</w:t>
+      </w:r>
+      <w:proofErr w:type="spellStart"/>
+      <w:r>
+        <w:rPr>
+          <w:rFonts w:ascii="Times New Roman" w:hAnsi="Times New Roman"/>
+          <w:sz w:val="24"/>
+          <w:szCs w:val="24"/>
+          <w:lang w:val="en-US"/>
+        </w:rPr>
+        <w:t>nbm</w:t>
+      </w:r>
+      <w:proofErr w:type="spellEnd"/>
+      <w:r>
+        <w:rPr>
+          <w:rFonts w:ascii="Times New Roman" w:hAnsi="Times New Roman"/>
+          <w:sz w:val="24"/>
+          <w:szCs w:val="24"/>
+          <w:lang w:val="en-US"/>
+        </w:rPr>
+        <w:t>}</w:t>
       </w:r>
     </w:p>
+    <w:bookmarkEnd w:id="3"/>
     <w:p>
       <w:pPr>
-        <w:spacing w:line="240" w:lineRule="auto"/>
+        <w:rPr>
+          <w:rFonts w:ascii="Times New Roman" w:hAnsi="Times New Roman"/>
+          <w:sz w:val="24"/>
+          <w:szCs w:val="24"/>
+        </w:rPr>
       </w:pPr>
     </w:p>
+    <w:p/>
     <w:sectPr>
       <w:headerReference w:type="even" r:id="rId8"/>
       <w:headerReference w:type="default" r:id="rId9"/>
@@ -1299,7 +1511,7 @@
 </file>
 
 <file path=word/endnotes.xml><?xml version="1.0" encoding="utf-8"?>
-<w:endnotes xmlns:wpc="http://schemas.microsoft.com/office/word/2010/wordprocessingCanvas" xmlns:cx="http://schemas.microsoft.com/office/drawing/2014/chartex" xmlns:cx1="http://schemas.microsoft.com/office/drawing/2015/9/8/chartex" xmlns:cx2="http://schemas.microsoft.com/office/drawing/2015/10/21/chartex" xmlns:cx3="http://schemas.microsoft.com/office/drawing/2016/5/9/chartex" xmlns:cx4="http://schemas.microsoft.com/office/drawing/2016/5/10/chartex" xmlns:cx5="http://schemas.microsoft.com/office/drawing/2016/5/11/chartex" xmlns:cx6="http://schemas.microsoft.com/office/drawing/2016/5/12/chartex" xmlns:cx7="http://schemas.microsoft.com/office/drawing/2016/5/13/chartex" xmlns:cx8="http://schemas.microsoft.com/office/drawing/2016/5/14/chartex" xmlns:mc="http://schemas.openxmlformats.org/markup-compatibility/2006" xmlns:aink="http://schemas.microsoft.com/office/drawing/2016/ink" xmlns:am3d="http://schemas.microsoft.com/office/drawing/2017/model3d" xmlns:o="urn:schemas-microsoft-com:office:office" xmlns:oel="http://schemas.microsoft.com/office/2019/extlst" xmlns:r="http://schemas.openxmlformats.org/officeDocument/2006/relationships" xmlns:m="http://schemas.openxmlformats.org/officeDocument/2006/math" xmlns:v="urn:schemas-microsoft-com:vml" xmlns:wp14="http://schemas.microsoft.com/office/word/2010/wordprocessingDrawing" xmlns:wp="http://schemas.openxmlformats.org/drawingml/2006/wordprocessingDrawing" xmlns:w10="urn:schemas-microsoft-com:office:word" xmlns:w="http://schemas.openxmlformats.org/wordprocessingml/2006/main" xmlns:w14="http://schemas.microsoft.com/office/word/2010/wordml" xmlns:w15="http://schemas.microsoft.com/office/word/2012/wordml" xmlns:w16cex="http://schemas.microsoft.com/office/word/2018/wordml/cex" xmlns:w16cid="http://schemas.microsoft.com/office/word/2016/wordml/cid" xmlns:w16="http://schemas.microsoft.com/office/word/2018/wordml" xmlns:w16du="http://schemas.microsoft.com/office/word/2023/wordml/word16du" xmlns:w16sdtdh="http://schemas.microsoft.com/office/word/2020/wordml/sdtdatahash" xmlns:w16se="http://schemas.microsoft.com/office/word/2015/wordml/symex" xmlns:wpg="http://schemas.microsoft.com/office/word/2010/wordprocessingGroup" xmlns:wpi="http://schemas.microsoft.com/office/word/2010/wordprocessingInk" xmlns:wne="http://schemas.microsoft.com/office/word/2006/wordml" xmlns:wps="http://schemas.microsoft.com/office/word/2010/wordprocessingShape" mc:Ignorable="w14 w15 w16se w16cid w16 w16cex w16sdtdh w16du wp14">
+<w:endnotes xmlns:wpc="http://schemas.microsoft.com/office/word/2010/wordprocessingCanvas" xmlns:cx="http://schemas.microsoft.com/office/drawing/2014/chartex" xmlns:cx1="http://schemas.microsoft.com/office/drawing/2015/9/8/chartex" xmlns:cx2="http://schemas.microsoft.com/office/drawing/2015/10/21/chartex" xmlns:cx3="http://schemas.microsoft.com/office/drawing/2016/5/9/chartex" xmlns:cx4="http://schemas.microsoft.com/office/drawing/2016/5/10/chartex" xmlns:cx5="http://schemas.microsoft.com/office/drawing/2016/5/11/chartex" xmlns:cx6="http://schemas.microsoft.com/office/drawing/2016/5/12/chartex" xmlns:cx7="http://schemas.microsoft.com/office/drawing/2016/5/13/chartex" xmlns:cx8="http://schemas.microsoft.com/office/drawing/2016/5/14/chartex" xmlns:mc="http://schemas.openxmlformats.org/markup-compatibility/2006" xmlns:aink="http://schemas.microsoft.com/office/drawing/2016/ink" xmlns:am3d="http://schemas.microsoft.com/office/drawing/2017/model3d" xmlns:o="urn:schemas-microsoft-com:office:office" xmlns:oel="http://schemas.microsoft.com/office/2019/extlst" xmlns:r="http://schemas.openxmlformats.org/officeDocument/2006/relationships" xmlns:m="http://schemas.openxmlformats.org/officeDocument/2006/math" xmlns:v="urn:schemas-microsoft-com:vml" xmlns:wp14="http://schemas.microsoft.com/office/word/2010/wordprocessingDrawing" xmlns:wp="http://schemas.openxmlformats.org/drawingml/2006/wordprocessingDrawing" xmlns:w10="urn:schemas-microsoft-com:office:word" xmlns:w="http://schemas.openxmlformats.org/wordprocessingml/2006/main" xmlns:w14="http://schemas.microsoft.com/office/word/2010/wordml" xmlns:w15="http://schemas.microsoft.com/office/word/2012/wordml" xmlns:w16cex="http://schemas.microsoft.com/office/word/2018/wordml/cex" xmlns:w16cid="http://schemas.microsoft.com/office/word/2016/wordml/cid" xmlns:w16="http://schemas.microsoft.com/office/word/2018/wordml" xmlns:w16sdtdh="http://schemas.microsoft.com/office/word/2020/wordml/sdtdatahash" xmlns:w16se="http://schemas.microsoft.com/office/word/2015/wordml/symex" xmlns:wpg="http://schemas.microsoft.com/office/word/2010/wordprocessingGroup" xmlns:wpi="http://schemas.microsoft.com/office/word/2010/wordprocessingInk" xmlns:wne="http://schemas.microsoft.com/office/word/2006/wordml" xmlns:wps="http://schemas.microsoft.com/office/word/2010/wordprocessingShape" mc:Ignorable="w14 w15 w16se w16cid w16 w16cex w16sdtdh wp14">
   <w:endnote w:type="separator" w:id="-1">
     <w:p>
       <w:pPr>
@@ -1324,7 +1536,7 @@
 </file>
 
 <file path=word/footnotes.xml><?xml version="1.0" encoding="utf-8"?>
-<w:footnotes xmlns:wpc="http://schemas.microsoft.com/office/word/2010/wordprocessingCanvas" xmlns:cx="http://schemas.microsoft.com/office/drawing/2014/chartex" xmlns:cx1="http://schemas.microsoft.com/office/drawing/2015/9/8/chartex" xmlns:cx2="http://schemas.microsoft.com/office/drawing/2015/10/21/chartex" xmlns:cx3="http://schemas.microsoft.com/office/drawing/2016/5/9/chartex" xmlns:cx4="http://schemas.microsoft.com/office/drawing/2016/5/10/chartex" xmlns:cx5="http://schemas.microsoft.com/office/drawing/2016/5/11/chartex" xmlns:cx6="http://schemas.microsoft.com/office/drawing/2016/5/12/chartex" xmlns:cx7="http://schemas.microsoft.com/office/drawing/2016/5/13/chartex" xmlns:cx8="http://schemas.microsoft.com/office/drawing/2016/5/14/chartex" xmlns:mc="http://schemas.openxmlformats.org/markup-compatibility/2006" xmlns:aink="http://schemas.microsoft.com/office/drawing/2016/ink" xmlns:am3d="http://schemas.microsoft.com/office/drawing/2017/model3d" xmlns:o="urn:schemas-microsoft-com:office:office" xmlns:oel="http://schemas.microsoft.com/office/2019/extlst" xmlns:r="http://schemas.openxmlformats.org/officeDocument/2006/relationships" xmlns:m="http://schemas.openxmlformats.org/officeDocument/2006/math" xmlns:v="urn:schemas-microsoft-com:vml" xmlns:wp14="http://schemas.microsoft.com/office/word/2010/wordprocessingDrawing" xmlns:wp="http://schemas.openxmlformats.org/drawingml/2006/wordprocessingDrawing" xmlns:w10="urn:schemas-microsoft-com:office:word" xmlns:w="http://schemas.openxmlformats.org/wordprocessingml/2006/main" xmlns:w14="http://schemas.microsoft.com/office/word/2010/wordml" xmlns:w15="http://schemas.microsoft.com/office/word/2012/wordml" xmlns:w16cex="http://schemas.microsoft.com/office/word/2018/wordml/cex" xmlns:w16cid="http://schemas.microsoft.com/office/word/2016/wordml/cid" xmlns:w16="http://schemas.microsoft.com/office/word/2018/wordml" xmlns:w16du="http://schemas.microsoft.com/office/word/2023/wordml/word16du" xmlns:w16sdtdh="http://schemas.microsoft.com/office/word/2020/wordml/sdtdatahash" xmlns:w16se="http://schemas.microsoft.com/office/word/2015/wordml/symex" xmlns:wpg="http://schemas.microsoft.com/office/word/2010/wordprocessingGroup" xmlns:wpi="http://schemas.microsoft.com/office/word/2010/wordprocessingInk" xmlns:wne="http://schemas.microsoft.com/office/word/2006/wordml" xmlns:wps="http://schemas.microsoft.com/office/word/2010/wordprocessingShape" mc:Ignorable="w14 w15 w16se w16cid w16 w16cex w16sdtdh w16du wp14">
+<w:footnotes xmlns:wpc="http://schemas.microsoft.com/office/word/2010/wordprocessingCanvas" xmlns:cx="http://schemas.microsoft.com/office/drawing/2014/chartex" xmlns:cx1="http://schemas.microsoft.com/office/drawing/2015/9/8/chartex" xmlns:cx2="http://schemas.microsoft.com/office/drawing/2015/10/21/chartex" xmlns:cx3="http://schemas.microsoft.com/office/drawing/2016/5/9/chartex" xmlns:cx4="http://schemas.microsoft.com/office/drawing/2016/5/10/chartex" xmlns:cx5="http://schemas.microsoft.com/office/drawing/2016/5/11/chartex" xmlns:cx6="http://schemas.microsoft.com/office/drawing/2016/5/12/chartex" xmlns:cx7="http://schemas.microsoft.com/office/drawing/2016/5/13/chartex" xmlns:cx8="http://schemas.microsoft.com/office/drawing/2016/5/14/chartex" xmlns:mc="http://schemas.openxmlformats.org/markup-compatibility/2006" xmlns:aink="http://schemas.microsoft.com/office/drawing/2016/ink" xmlns:am3d="http://schemas.microsoft.com/office/drawing/2017/model3d" xmlns:o="urn:schemas-microsoft-com:office:office" xmlns:oel="http://schemas.microsoft.com/office/2019/extlst" xmlns:r="http://schemas.openxmlformats.org/officeDocument/2006/relationships" xmlns:m="http://schemas.openxmlformats.org/officeDocument/2006/math" xmlns:v="urn:schemas-microsoft-com:vml" xmlns:wp14="http://schemas.microsoft.com/office/word/2010/wordprocessingDrawing" xmlns:wp="http://schemas.openxmlformats.org/drawingml/2006/wordprocessingDrawing" xmlns:w10="urn:schemas-microsoft-com:office:word" xmlns:w="http://schemas.openxmlformats.org/wordprocessingml/2006/main" xmlns:w14="http://schemas.microsoft.com/office/word/2010/wordml" xmlns:w15="http://schemas.microsoft.com/office/word/2012/wordml" xmlns:w16cex="http://schemas.microsoft.com/office/word/2018/wordml/cex" xmlns:w16cid="http://schemas.microsoft.com/office/word/2016/wordml/cid" xmlns:w16="http://schemas.microsoft.com/office/word/2018/wordml" xmlns:w16sdtdh="http://schemas.microsoft.com/office/word/2020/wordml/sdtdatahash" xmlns:w16se="http://schemas.microsoft.com/office/word/2015/wordml/symex" xmlns:wpg="http://schemas.microsoft.com/office/word/2010/wordprocessingGroup" xmlns:wpi="http://schemas.microsoft.com/office/word/2010/wordprocessingInk" xmlns:wne="http://schemas.microsoft.com/office/word/2006/wordml" xmlns:wps="http://schemas.microsoft.com/office/word/2010/wordprocessingShape" mc:Ignorable="w14 w15 w16se w16cid w16 w16cex w16sdtdh wp14">
   <w:footnote w:type="separator" w:id="-1">
     <w:p>
       <w:pPr>
@@ -1349,7 +1561,7 @@
 </file>
 
 <file path=word/header1.xml><?xml version="1.0" encoding="utf-8"?>
-<w:hdr xmlns:wpc="http://schemas.microsoft.com/office/word/2010/wordprocessingCanvas" xmlns:cx="http://schemas.microsoft.com/office/drawing/2014/chartex" xmlns:cx1="http://schemas.microsoft.com/office/drawing/2015/9/8/chartex" xmlns:cx2="http://schemas.microsoft.com/office/drawing/2015/10/21/chartex" xmlns:cx3="http://schemas.microsoft.com/office/drawing/2016/5/9/chartex" xmlns:cx4="http://schemas.microsoft.com/office/drawing/2016/5/10/chartex" xmlns:cx5="http://schemas.microsoft.com/office/drawing/2016/5/11/chartex" xmlns:cx6="http://schemas.microsoft.com/office/drawing/2016/5/12/chartex" xmlns:cx7="http://schemas.microsoft.com/office/drawing/2016/5/13/chartex" xmlns:cx8="http://schemas.microsoft.com/office/drawing/2016/5/14/chartex" xmlns:mc="http://schemas.openxmlformats.org/markup-compatibility/2006" xmlns:aink="http://schemas.microsoft.com/office/drawing/2016/ink" xmlns:am3d="http://schemas.microsoft.com/office/drawing/2017/model3d" xmlns:o="urn:schemas-microsoft-com:office:office" xmlns:oel="http://schemas.microsoft.com/office/2019/extlst" xmlns:r="http://schemas.openxmlformats.org/officeDocument/2006/relationships" xmlns:m="http://schemas.openxmlformats.org/officeDocument/2006/math" xmlns:v="urn:schemas-microsoft-com:vml" xmlns:wp14="http://schemas.microsoft.com/office/word/2010/wordprocessingDrawing" xmlns:wp="http://schemas.openxmlformats.org/drawingml/2006/wordprocessingDrawing" xmlns:w10="urn:schemas-microsoft-com:office:word" xmlns:w="http://schemas.openxmlformats.org/wordprocessingml/2006/main" xmlns:w14="http://schemas.microsoft.com/office/word/2010/wordml" xmlns:w15="http://schemas.microsoft.com/office/word/2012/wordml" xmlns:w16cex="http://schemas.microsoft.com/office/word/2018/wordml/cex" xmlns:w16cid="http://schemas.microsoft.com/office/word/2016/wordml/cid" xmlns:w16="http://schemas.microsoft.com/office/word/2018/wordml" xmlns:w16du="http://schemas.microsoft.com/office/word/2023/wordml/word16du" xmlns:w16sdtdh="http://schemas.microsoft.com/office/word/2020/wordml/sdtdatahash" xmlns:w16se="http://schemas.microsoft.com/office/word/2015/wordml/symex" xmlns:wpg="http://schemas.microsoft.com/office/word/2010/wordprocessingGroup" xmlns:wpi="http://schemas.microsoft.com/office/word/2010/wordprocessingInk" xmlns:wne="http://schemas.microsoft.com/office/word/2006/wordml" xmlns:wps="http://schemas.microsoft.com/office/word/2010/wordprocessingShape" mc:Ignorable="w14 w15 w16se w16cid w16 w16cex w16sdtdh w16du wp14">
+<w:hdr xmlns:wpc="http://schemas.microsoft.com/office/word/2010/wordprocessingCanvas" xmlns:cx="http://schemas.microsoft.com/office/drawing/2014/chartex" xmlns:cx1="http://schemas.microsoft.com/office/drawing/2015/9/8/chartex" xmlns:cx2="http://schemas.microsoft.com/office/drawing/2015/10/21/chartex" xmlns:cx3="http://schemas.microsoft.com/office/drawing/2016/5/9/chartex" xmlns:cx4="http://schemas.microsoft.com/office/drawing/2016/5/10/chartex" xmlns:cx5="http://schemas.microsoft.com/office/drawing/2016/5/11/chartex" xmlns:cx6="http://schemas.microsoft.com/office/drawing/2016/5/12/chartex" xmlns:cx7="http://schemas.microsoft.com/office/drawing/2016/5/13/chartex" xmlns:cx8="http://schemas.microsoft.com/office/drawing/2016/5/14/chartex" xmlns:mc="http://schemas.openxmlformats.org/markup-compatibility/2006" xmlns:aink="http://schemas.microsoft.com/office/drawing/2016/ink" xmlns:am3d="http://schemas.microsoft.com/office/drawing/2017/model3d" xmlns:o="urn:schemas-microsoft-com:office:office" xmlns:oel="http://schemas.microsoft.com/office/2019/extlst" xmlns:r="http://schemas.openxmlformats.org/officeDocument/2006/relationships" xmlns:m="http://schemas.openxmlformats.org/officeDocument/2006/math" xmlns:v="urn:schemas-microsoft-com:vml" xmlns:wp14="http://schemas.microsoft.com/office/word/2010/wordprocessingDrawing" xmlns:wp="http://schemas.openxmlformats.org/drawingml/2006/wordprocessingDrawing" xmlns:w10="urn:schemas-microsoft-com:office:word" xmlns:w="http://schemas.openxmlformats.org/wordprocessingml/2006/main" xmlns:w14="http://schemas.microsoft.com/office/word/2010/wordml" xmlns:w15="http://schemas.microsoft.com/office/word/2012/wordml" xmlns:w16cex="http://schemas.microsoft.com/office/word/2018/wordml/cex" xmlns:w16cid="http://schemas.microsoft.com/office/word/2016/wordml/cid" xmlns:w16="http://schemas.microsoft.com/office/word/2018/wordml" xmlns:w16sdtdh="http://schemas.microsoft.com/office/word/2020/wordml/sdtdatahash" xmlns:w16se="http://schemas.microsoft.com/office/word/2015/wordml/symex" xmlns:wpg="http://schemas.microsoft.com/office/word/2010/wordprocessingGroup" xmlns:wpi="http://schemas.microsoft.com/office/word/2010/wordprocessingInk" xmlns:wne="http://schemas.microsoft.com/office/word/2006/wordml" xmlns:wps="http://schemas.microsoft.com/office/word/2010/wordprocessingShape" mc:Ignorable="w14 w15 w16se w16cid w16 w16cex w16sdtdh wp14">
   <w:p>
     <w:pPr>
       <w:pStyle w:val="Header"/>
@@ -1390,7 +1602,7 @@
 </file>
 
 <file path=word/header2.xml><?xml version="1.0" encoding="utf-8"?>
-<w:hdr xmlns:wpc="http://schemas.microsoft.com/office/word/2010/wordprocessingCanvas" xmlns:cx="http://schemas.microsoft.com/office/drawing/2014/chartex" xmlns:cx1="http://schemas.microsoft.com/office/drawing/2015/9/8/chartex" xmlns:cx2="http://schemas.microsoft.com/office/drawing/2015/10/21/chartex" xmlns:cx3="http://schemas.microsoft.com/office/drawing/2016/5/9/chartex" xmlns:cx4="http://schemas.microsoft.com/office/drawing/2016/5/10/chartex" xmlns:cx5="http://schemas.microsoft.com/office/drawing/2016/5/11/chartex" xmlns:cx6="http://schemas.microsoft.com/office/drawing/2016/5/12/chartex" xmlns:cx7="http://schemas.microsoft.com/office/drawing/2016/5/13/chartex" xmlns:cx8="http://schemas.microsoft.com/office/drawing/2016/5/14/chartex" xmlns:mc="http://schemas.openxmlformats.org/markup-compatibility/2006" xmlns:aink="http://schemas.microsoft.com/office/drawing/2016/ink" xmlns:am3d="http://schemas.microsoft.com/office/drawing/2017/model3d" xmlns:o="urn:schemas-microsoft-com:office:office" xmlns:oel="http://schemas.microsoft.com/office/2019/extlst" xmlns:r="http://schemas.openxmlformats.org/officeDocument/2006/relationships" xmlns:m="http://schemas.openxmlformats.org/officeDocument/2006/math" xmlns:v="urn:schemas-microsoft-com:vml" xmlns:wp14="http://schemas.microsoft.com/office/word/2010/wordprocessingDrawing" xmlns:wp="http://schemas.openxmlformats.org/drawingml/2006/wordprocessingDrawing" xmlns:w10="urn:schemas-microsoft-com:office:word" xmlns:w="http://schemas.openxmlformats.org/wordprocessingml/2006/main" xmlns:w14="http://schemas.microsoft.com/office/word/2010/wordml" xmlns:w15="http://schemas.microsoft.com/office/word/2012/wordml" xmlns:w16cex="http://schemas.microsoft.com/office/word/2018/wordml/cex" xmlns:w16cid="http://schemas.microsoft.com/office/word/2016/wordml/cid" xmlns:w16="http://schemas.microsoft.com/office/word/2018/wordml" xmlns:w16du="http://schemas.microsoft.com/office/word/2023/wordml/word16du" xmlns:w16sdtdh="http://schemas.microsoft.com/office/word/2020/wordml/sdtdatahash" xmlns:w16se="http://schemas.microsoft.com/office/word/2015/wordml/symex" xmlns:wpg="http://schemas.microsoft.com/office/word/2010/wordprocessingGroup" xmlns:wpi="http://schemas.microsoft.com/office/word/2010/wordprocessingInk" xmlns:wne="http://schemas.microsoft.com/office/word/2006/wordml" xmlns:wps="http://schemas.microsoft.com/office/word/2010/wordprocessingShape" mc:Ignorable="w14 w15 w16se w16cid w16 w16cex w16sdtdh w16du wp14">
+<w:hdr xmlns:wpc="http://schemas.microsoft.com/office/word/2010/wordprocessingCanvas" xmlns:cx="http://schemas.microsoft.com/office/drawing/2014/chartex" xmlns:cx1="http://schemas.microsoft.com/office/drawing/2015/9/8/chartex" xmlns:cx2="http://schemas.microsoft.com/office/drawing/2015/10/21/chartex" xmlns:cx3="http://schemas.microsoft.com/office/drawing/2016/5/9/chartex" xmlns:cx4="http://schemas.microsoft.com/office/drawing/2016/5/10/chartex" xmlns:cx5="http://schemas.microsoft.com/office/drawing/2016/5/11/chartex" xmlns:cx6="http://schemas.microsoft.com/office/drawing/2016/5/12/chartex" xmlns:cx7="http://schemas.microsoft.com/office/drawing/2016/5/13/chartex" xmlns:cx8="http://schemas.microsoft.com/office/drawing/2016/5/14/chartex" xmlns:mc="http://schemas.openxmlformats.org/markup-compatibility/2006" xmlns:aink="http://schemas.microsoft.com/office/drawing/2016/ink" xmlns:am3d="http://schemas.microsoft.com/office/drawing/2017/model3d" xmlns:o="urn:schemas-microsoft-com:office:office" xmlns:oel="http://schemas.microsoft.com/office/2019/extlst" xmlns:r="http://schemas.openxmlformats.org/officeDocument/2006/relationships" xmlns:m="http://schemas.openxmlformats.org/officeDocument/2006/math" xmlns:v="urn:schemas-microsoft-com:vml" xmlns:wp14="http://schemas.microsoft.com/office/word/2010/wordprocessingDrawing" xmlns:wp="http://schemas.openxmlformats.org/drawingml/2006/wordprocessingDrawing" xmlns:w10="urn:schemas-microsoft-com:office:word" xmlns:w="http://schemas.openxmlformats.org/wordprocessingml/2006/main" xmlns:w14="http://schemas.microsoft.com/office/word/2010/wordml" xmlns:w15="http://schemas.microsoft.com/office/word/2012/wordml" xmlns:w16cex="http://schemas.microsoft.com/office/word/2018/wordml/cex" xmlns:w16cid="http://schemas.microsoft.com/office/word/2016/wordml/cid" xmlns:w16="http://schemas.microsoft.com/office/word/2018/wordml" xmlns:w16sdtdh="http://schemas.microsoft.com/office/word/2020/wordml/sdtdatahash" xmlns:w16se="http://schemas.microsoft.com/office/word/2015/wordml/symex" xmlns:wpg="http://schemas.microsoft.com/office/word/2010/wordprocessingGroup" xmlns:wpi="http://schemas.microsoft.com/office/word/2010/wordprocessingInk" xmlns:wne="http://schemas.microsoft.com/office/word/2006/wordml" xmlns:wps="http://schemas.microsoft.com/office/word/2010/wordprocessingShape" mc:Ignorable="w14 w15 w16se w16cid w16 w16cex w16sdtdh wp14">
   <w:p>
     <w:pPr>
       <w:pStyle w:val="Header"/>
@@ -1411,7 +1623,7 @@
           <wp:extent cx="2307462" cy="396000"/>
           <wp:effectExtent l="0" t="0" r="0" b="4445"/>
           <wp:wrapNone/>
-          <wp:docPr id="1551712264" name="Picture 1551712264"/>
+          <wp:docPr id="8" name="Picture 8"/>
           <wp:cNvGraphicFramePr>
             <a:graphicFrameLocks xmlns:a="http://schemas.openxmlformats.org/drawingml/2006/main" noChangeAspect="1"/>
           </wp:cNvGraphicFramePr>
@@ -1481,7 +1693,7 @@
           <wp:extent cx="5799221" cy="5799221"/>
           <wp:effectExtent l="0" t="0" r="0" b="0"/>
           <wp:wrapNone/>
-          <wp:docPr id="888829640" name="Picture 888829640"/>
+          <wp:docPr id="9" name="Picture 9"/>
           <wp:cNvGraphicFramePr>
             <a:graphicFrameLocks xmlns:a="http://schemas.openxmlformats.org/drawingml/2006/main" noChangeAspect="1"/>
           </wp:cNvGraphicFramePr>
@@ -1542,7 +1754,7 @@
           <wp:extent cx="7610475" cy="11772900"/>
           <wp:effectExtent l="0" t="0" r="9525" b="0"/>
           <wp:wrapNone/>
-          <wp:docPr id="759416402" name="Picture 759416402"/>
+          <wp:docPr id="10" name="Picture 10"/>
           <wp:cNvGraphicFramePr>
             <a:graphicFrameLocks xmlns:a="http://schemas.openxmlformats.org/drawingml/2006/main" noChangeAspect="1"/>
           </wp:cNvGraphicFramePr>
@@ -1591,7 +1803,7 @@
 </file>
 
 <file path=word/header3.xml><?xml version="1.0" encoding="utf-8"?>
-<w:hdr xmlns:wpc="http://schemas.microsoft.com/office/word/2010/wordprocessingCanvas" xmlns:cx="http://schemas.microsoft.com/office/drawing/2014/chartex" xmlns:cx1="http://schemas.microsoft.com/office/drawing/2015/9/8/chartex" xmlns:cx2="http://schemas.microsoft.com/office/drawing/2015/10/21/chartex" xmlns:cx3="http://schemas.microsoft.com/office/drawing/2016/5/9/chartex" xmlns:cx4="http://schemas.microsoft.com/office/drawing/2016/5/10/chartex" xmlns:cx5="http://schemas.microsoft.com/office/drawing/2016/5/11/chartex" xmlns:cx6="http://schemas.microsoft.com/office/drawing/2016/5/12/chartex" xmlns:cx7="http://schemas.microsoft.com/office/drawing/2016/5/13/chartex" xmlns:cx8="http://schemas.microsoft.com/office/drawing/2016/5/14/chartex" xmlns:mc="http://schemas.openxmlformats.org/markup-compatibility/2006" xmlns:aink="http://schemas.microsoft.com/office/drawing/2016/ink" xmlns:am3d="http://schemas.microsoft.com/office/drawing/2017/model3d" xmlns:o="urn:schemas-microsoft-com:office:office" xmlns:oel="http://schemas.microsoft.com/office/2019/extlst" xmlns:r="http://schemas.openxmlformats.org/officeDocument/2006/relationships" xmlns:m="http://schemas.openxmlformats.org/officeDocument/2006/math" xmlns:v="urn:schemas-microsoft-com:vml" xmlns:wp14="http://schemas.microsoft.com/office/word/2010/wordprocessingDrawing" xmlns:wp="http://schemas.openxmlformats.org/drawingml/2006/wordprocessingDrawing" xmlns:w10="urn:schemas-microsoft-com:office:word" xmlns:w="http://schemas.openxmlformats.org/wordprocessingml/2006/main" xmlns:w14="http://schemas.microsoft.com/office/word/2010/wordml" xmlns:w15="http://schemas.microsoft.com/office/word/2012/wordml" xmlns:w16cex="http://schemas.microsoft.com/office/word/2018/wordml/cex" xmlns:w16cid="http://schemas.microsoft.com/office/word/2016/wordml/cid" xmlns:w16="http://schemas.microsoft.com/office/word/2018/wordml" xmlns:w16du="http://schemas.microsoft.com/office/word/2023/wordml/word16du" xmlns:w16sdtdh="http://schemas.microsoft.com/office/word/2020/wordml/sdtdatahash" xmlns:w16se="http://schemas.microsoft.com/office/word/2015/wordml/symex" xmlns:wpg="http://schemas.microsoft.com/office/word/2010/wordprocessingGroup" xmlns:wpi="http://schemas.microsoft.com/office/word/2010/wordprocessingInk" xmlns:wne="http://schemas.microsoft.com/office/word/2006/wordml" xmlns:wps="http://schemas.microsoft.com/office/word/2010/wordprocessingShape" mc:Ignorable="w14 w15 w16se w16cid w16 w16cex w16sdtdh w16du wp14">
+<w:hdr xmlns:wpc="http://schemas.microsoft.com/office/word/2010/wordprocessingCanvas" xmlns:cx="http://schemas.microsoft.com/office/drawing/2014/chartex" xmlns:cx1="http://schemas.microsoft.com/office/drawing/2015/9/8/chartex" xmlns:cx2="http://schemas.microsoft.com/office/drawing/2015/10/21/chartex" xmlns:cx3="http://schemas.microsoft.com/office/drawing/2016/5/9/chartex" xmlns:cx4="http://schemas.microsoft.com/office/drawing/2016/5/10/chartex" xmlns:cx5="http://schemas.microsoft.com/office/drawing/2016/5/11/chartex" xmlns:cx6="http://schemas.microsoft.com/office/drawing/2016/5/12/chartex" xmlns:cx7="http://schemas.microsoft.com/office/drawing/2016/5/13/chartex" xmlns:cx8="http://schemas.microsoft.com/office/drawing/2016/5/14/chartex" xmlns:mc="http://schemas.openxmlformats.org/markup-compatibility/2006" xmlns:aink="http://schemas.microsoft.com/office/drawing/2016/ink" xmlns:am3d="http://schemas.microsoft.com/office/drawing/2017/model3d" xmlns:o="urn:schemas-microsoft-com:office:office" xmlns:oel="http://schemas.microsoft.com/office/2019/extlst" xmlns:r="http://schemas.openxmlformats.org/officeDocument/2006/relationships" xmlns:m="http://schemas.openxmlformats.org/officeDocument/2006/math" xmlns:v="urn:schemas-microsoft-com:vml" xmlns:wp14="http://schemas.microsoft.com/office/word/2010/wordprocessingDrawing" xmlns:wp="http://schemas.openxmlformats.org/drawingml/2006/wordprocessingDrawing" xmlns:w10="urn:schemas-microsoft-com:office:word" xmlns:w="http://schemas.openxmlformats.org/wordprocessingml/2006/main" xmlns:w14="http://schemas.microsoft.com/office/word/2010/wordml" xmlns:w15="http://schemas.microsoft.com/office/word/2012/wordml" xmlns:w16cex="http://schemas.microsoft.com/office/word/2018/wordml/cex" xmlns:w16cid="http://schemas.microsoft.com/office/word/2016/wordml/cid" xmlns:w16="http://schemas.microsoft.com/office/word/2018/wordml" xmlns:w16sdtdh="http://schemas.microsoft.com/office/word/2020/wordml/sdtdatahash" xmlns:w16se="http://schemas.microsoft.com/office/word/2015/wordml/symex" xmlns:wpg="http://schemas.microsoft.com/office/word/2010/wordprocessingGroup" xmlns:wpi="http://schemas.microsoft.com/office/word/2010/wordprocessingInk" xmlns:wne="http://schemas.microsoft.com/office/word/2006/wordml" xmlns:wps="http://schemas.microsoft.com/office/word/2010/wordprocessingShape" mc:Ignorable="w14 w15 w16se w16cid w16 w16cex w16sdtdh wp14">
   <w:p>
     <w:pPr>
       <w:pStyle w:val="Header"/>
@@ -1632,7 +1844,7 @@
 </file>
 
 <file path=word/numbering.xml><?xml version="1.0" encoding="utf-8"?>
-<w:numbering xmlns:wpc="http://schemas.microsoft.com/office/word/2010/wordprocessingCanvas" xmlns:cx="http://schemas.microsoft.com/office/drawing/2014/chartex" xmlns:cx1="http://schemas.microsoft.com/office/drawing/2015/9/8/chartex" xmlns:cx2="http://schemas.microsoft.com/office/drawing/2015/10/21/chartex" xmlns:cx3="http://schemas.microsoft.com/office/drawing/2016/5/9/chartex" xmlns:cx4="http://schemas.microsoft.com/office/drawing/2016/5/10/chartex" xmlns:cx5="http://schemas.microsoft.com/office/drawing/2016/5/11/chartex" xmlns:cx6="http://schemas.microsoft.com/office/drawing/2016/5/12/chartex" xmlns:cx7="http://schemas.microsoft.com/office/drawing/2016/5/13/chartex" xmlns:cx8="http://schemas.microsoft.com/office/drawing/2016/5/14/chartex" xmlns:mc="http://schemas.openxmlformats.org/markup-compatibility/2006" xmlns:aink="http://schemas.microsoft.com/office/drawing/2016/ink" xmlns:am3d="http://schemas.microsoft.com/office/drawing/2017/model3d" xmlns:o="urn:schemas-microsoft-com:office:office" xmlns:oel="http://schemas.microsoft.com/office/2019/extlst" xmlns:r="http://schemas.openxmlformats.org/officeDocument/2006/relationships" xmlns:m="http://schemas.openxmlformats.org/officeDocument/2006/math" xmlns:v="urn:schemas-microsoft-com:vml" xmlns:wp14="http://schemas.microsoft.com/office/word/2010/wordprocessingDrawing" xmlns:wp="http://schemas.openxmlformats.org/drawingml/2006/wordprocessingDrawing" xmlns:w10="urn:schemas-microsoft-com:office:word" xmlns:w="http://schemas.openxmlformats.org/wordprocessingml/2006/main" xmlns:w14="http://schemas.microsoft.com/office/word/2010/wordml" xmlns:w15="http://schemas.microsoft.com/office/word/2012/wordml" xmlns:w16cex="http://schemas.microsoft.com/office/word/2018/wordml/cex" xmlns:w16cid="http://schemas.microsoft.com/office/word/2016/wordml/cid" xmlns:w16="http://schemas.microsoft.com/office/word/2018/wordml" xmlns:w16du="http://schemas.microsoft.com/office/word/2023/wordml/word16du" xmlns:w16sdtdh="http://schemas.microsoft.com/office/word/2020/wordml/sdtdatahash" xmlns:w16se="http://schemas.microsoft.com/office/word/2015/wordml/symex" xmlns:wpg="http://schemas.microsoft.com/office/word/2010/wordprocessingGroup" xmlns:wpi="http://schemas.microsoft.com/office/word/2010/wordprocessingInk" xmlns:wne="http://schemas.microsoft.com/office/word/2006/wordml" xmlns:wps="http://schemas.microsoft.com/office/word/2010/wordprocessingShape" mc:Ignorable="w14 w15 w16se w16cid w16 w16cex w16sdtdh w16du wp14">
+<w:numbering xmlns:wpc="http://schemas.microsoft.com/office/word/2010/wordprocessingCanvas" xmlns:cx="http://schemas.microsoft.com/office/drawing/2014/chartex" xmlns:cx1="http://schemas.microsoft.com/office/drawing/2015/9/8/chartex" xmlns:cx2="http://schemas.microsoft.com/office/drawing/2015/10/21/chartex" xmlns:cx3="http://schemas.microsoft.com/office/drawing/2016/5/9/chartex" xmlns:cx4="http://schemas.microsoft.com/office/drawing/2016/5/10/chartex" xmlns:cx5="http://schemas.microsoft.com/office/drawing/2016/5/11/chartex" xmlns:cx6="http://schemas.microsoft.com/office/drawing/2016/5/12/chartex" xmlns:cx7="http://schemas.microsoft.com/office/drawing/2016/5/13/chartex" xmlns:cx8="http://schemas.microsoft.com/office/drawing/2016/5/14/chartex" xmlns:mc="http://schemas.openxmlformats.org/markup-compatibility/2006" xmlns:aink="http://schemas.microsoft.com/office/drawing/2016/ink" xmlns:am3d="http://schemas.microsoft.com/office/drawing/2017/model3d" xmlns:o="urn:schemas-microsoft-com:office:office" xmlns:oel="http://schemas.microsoft.com/office/2019/extlst" xmlns:r="http://schemas.openxmlformats.org/officeDocument/2006/relationships" xmlns:m="http://schemas.openxmlformats.org/officeDocument/2006/math" xmlns:v="urn:schemas-microsoft-com:vml" xmlns:wp14="http://schemas.microsoft.com/office/word/2010/wordprocessingDrawing" xmlns:wp="http://schemas.openxmlformats.org/drawingml/2006/wordprocessingDrawing" xmlns:w10="urn:schemas-microsoft-com:office:word" xmlns:w="http://schemas.openxmlformats.org/wordprocessingml/2006/main" xmlns:w14="http://schemas.microsoft.com/office/word/2010/wordml" xmlns:w15="http://schemas.microsoft.com/office/word/2012/wordml" xmlns:w16cex="http://schemas.microsoft.com/office/word/2018/wordml/cex" xmlns:w16cid="http://schemas.microsoft.com/office/word/2016/wordml/cid" xmlns:w16="http://schemas.microsoft.com/office/word/2018/wordml" xmlns:w16sdtdh="http://schemas.microsoft.com/office/word/2020/wordml/sdtdatahash" xmlns:w16se="http://schemas.microsoft.com/office/word/2015/wordml/symex" xmlns:wpg="http://schemas.microsoft.com/office/word/2010/wordprocessingGroup" xmlns:wpi="http://schemas.microsoft.com/office/word/2010/wordprocessingInk" xmlns:wne="http://schemas.microsoft.com/office/word/2006/wordml" xmlns:wps="http://schemas.microsoft.com/office/word/2010/wordprocessingShape" mc:Ignorable="w14 w15 w16se w16cid w16 w16cex w16sdtdh wp14">
   <w:abstractNum w:abstractNumId="0" w15:restartNumberingAfterBreak="0">
     <w:nsid w:val="0656449C"/>
     <w:multiLevelType w:val="hybridMultilevel"/>
@@ -4523,107 +4735,107 @@
       </w:pPr>
     </w:lvl>
   </w:abstractNum>
-  <w:num w:numId="1" w16cid:durableId="1478034923">
+  <w:num w:numId="1" w16cid:durableId="142553096">
     <w:abstractNumId w:val="2"/>
   </w:num>
-  <w:num w:numId="2" w16cid:durableId="1121993204">
+  <w:num w:numId="2" w16cid:durableId="1104300519">
     <w:abstractNumId w:val="18"/>
   </w:num>
-  <w:num w:numId="3" w16cid:durableId="380639698">
+  <w:num w:numId="3" w16cid:durableId="746926219">
     <w:abstractNumId w:val="27"/>
   </w:num>
-  <w:num w:numId="4" w16cid:durableId="2086485902">
+  <w:num w:numId="4" w16cid:durableId="2023513491">
     <w:abstractNumId w:val="13"/>
   </w:num>
-  <w:num w:numId="5" w16cid:durableId="1635597913">
+  <w:num w:numId="5" w16cid:durableId="851800550">
     <w:abstractNumId w:val="25"/>
   </w:num>
-  <w:num w:numId="6" w16cid:durableId="766273345">
+  <w:num w:numId="6" w16cid:durableId="1063793201">
     <w:abstractNumId w:val="12"/>
   </w:num>
-  <w:num w:numId="7" w16cid:durableId="35593966">
+  <w:num w:numId="7" w16cid:durableId="328362535">
     <w:abstractNumId w:val="29"/>
   </w:num>
-  <w:num w:numId="8" w16cid:durableId="665399934">
+  <w:num w:numId="8" w16cid:durableId="459686502">
     <w:abstractNumId w:val="14"/>
   </w:num>
-  <w:num w:numId="9" w16cid:durableId="412318093">
+  <w:num w:numId="9" w16cid:durableId="1656060703">
     <w:abstractNumId w:val="11"/>
   </w:num>
-  <w:num w:numId="10" w16cid:durableId="363403872">
+  <w:num w:numId="10" w16cid:durableId="1713189644">
     <w:abstractNumId w:val="9"/>
   </w:num>
-  <w:num w:numId="11" w16cid:durableId="295185552">
+  <w:num w:numId="11" w16cid:durableId="608657846">
     <w:abstractNumId w:val="31"/>
   </w:num>
-  <w:num w:numId="12" w16cid:durableId="1102384015">
+  <w:num w:numId="12" w16cid:durableId="351804616">
     <w:abstractNumId w:val="8"/>
   </w:num>
-  <w:num w:numId="13" w16cid:durableId="111293734">
+  <w:num w:numId="13" w16cid:durableId="577322390">
     <w:abstractNumId w:val="6"/>
   </w:num>
-  <w:num w:numId="14" w16cid:durableId="1352294328">
+  <w:num w:numId="14" w16cid:durableId="1482501098">
     <w:abstractNumId w:val="4"/>
   </w:num>
-  <w:num w:numId="15" w16cid:durableId="2132243676">
+  <w:num w:numId="15" w16cid:durableId="1637639791">
     <w:abstractNumId w:val="22"/>
   </w:num>
-  <w:num w:numId="16" w16cid:durableId="1109666715">
+  <w:num w:numId="16" w16cid:durableId="1781099216">
     <w:abstractNumId w:val="7"/>
   </w:num>
-  <w:num w:numId="17" w16cid:durableId="1119227492">
+  <w:num w:numId="17" w16cid:durableId="666789775">
     <w:abstractNumId w:val="23"/>
   </w:num>
-  <w:num w:numId="18" w16cid:durableId="1069571237">
+  <w:num w:numId="18" w16cid:durableId="1483766552">
     <w:abstractNumId w:val="30"/>
   </w:num>
-  <w:num w:numId="19" w16cid:durableId="589974358">
+  <w:num w:numId="19" w16cid:durableId="990791705">
     <w:abstractNumId w:val="0"/>
   </w:num>
-  <w:num w:numId="20" w16cid:durableId="1443113404">
+  <w:num w:numId="20" w16cid:durableId="595601484">
     <w:abstractNumId w:val="16"/>
   </w:num>
-  <w:num w:numId="21" w16cid:durableId="1025322878">
+  <w:num w:numId="21" w16cid:durableId="1954289128">
     <w:abstractNumId w:val="15"/>
   </w:num>
-  <w:num w:numId="22" w16cid:durableId="1821266805">
+  <w:num w:numId="22" w16cid:durableId="1367949121">
     <w:abstractNumId w:val="19"/>
   </w:num>
-  <w:num w:numId="23" w16cid:durableId="120464722">
+  <w:num w:numId="23" w16cid:durableId="1180042383">
     <w:abstractNumId w:val="28"/>
   </w:num>
-  <w:num w:numId="24" w16cid:durableId="786851576">
+  <w:num w:numId="24" w16cid:durableId="699476153">
     <w:abstractNumId w:val="20"/>
   </w:num>
-  <w:num w:numId="25" w16cid:durableId="255359623">
+  <w:num w:numId="25" w16cid:durableId="466360445">
     <w:abstractNumId w:val="1"/>
   </w:num>
-  <w:num w:numId="26" w16cid:durableId="679742490">
+  <w:num w:numId="26" w16cid:durableId="2139881792">
     <w:abstractNumId w:val="5"/>
   </w:num>
-  <w:num w:numId="27" w16cid:durableId="998846895">
+  <w:num w:numId="27" w16cid:durableId="737359256">
     <w:abstractNumId w:val="24"/>
   </w:num>
-  <w:num w:numId="28" w16cid:durableId="151142970">
+  <w:num w:numId="28" w16cid:durableId="660079371">
     <w:abstractNumId w:val="26"/>
   </w:num>
-  <w:num w:numId="29" w16cid:durableId="156265192">
+  <w:num w:numId="29" w16cid:durableId="1844974114">
     <w:abstractNumId w:val="3"/>
   </w:num>
-  <w:num w:numId="30" w16cid:durableId="755980584">
+  <w:num w:numId="30" w16cid:durableId="1575164716">
     <w:abstractNumId w:val="21"/>
   </w:num>
-  <w:num w:numId="31" w16cid:durableId="1516729186">
+  <w:num w:numId="31" w16cid:durableId="388726520">
     <w:abstractNumId w:val="10"/>
   </w:num>
-  <w:num w:numId="32" w16cid:durableId="550504207">
+  <w:num w:numId="32" w16cid:durableId="852065445">
     <w:abstractNumId w:val="17"/>
   </w:num>
 </w:numbering>
 </file>
 
 <file path=word/styles.xml><?xml version="1.0" encoding="utf-8"?>
-<w:styles xmlns:mc="http://schemas.openxmlformats.org/markup-compatibility/2006" xmlns:r="http://schemas.openxmlformats.org/officeDocument/2006/relationships" xmlns:w="http://schemas.openxmlformats.org/wordprocessingml/2006/main" xmlns:w14="http://schemas.microsoft.com/office/word/2010/wordml" xmlns:w15="http://schemas.microsoft.com/office/word/2012/wordml" xmlns:w16cex="http://schemas.microsoft.com/office/word/2018/wordml/cex" xmlns:w16cid="http://schemas.microsoft.com/office/word/2016/wordml/cid" xmlns:w16="http://schemas.microsoft.com/office/word/2018/wordml" xmlns:w16du="http://schemas.microsoft.com/office/word/2023/wordml/word16du" xmlns:w16sdtdh="http://schemas.microsoft.com/office/word/2020/wordml/sdtdatahash" xmlns:w16se="http://schemas.microsoft.com/office/word/2015/wordml/symex" mc:Ignorable="w14 w15 w16se w16cid w16 w16cex w16sdtdh w16du">
+<w:styles xmlns:mc="http://schemas.openxmlformats.org/markup-compatibility/2006" xmlns:r="http://schemas.openxmlformats.org/officeDocument/2006/relationships" xmlns:w="http://schemas.openxmlformats.org/wordprocessingml/2006/main" xmlns:w14="http://schemas.microsoft.com/office/word/2010/wordml" xmlns:w15="http://schemas.microsoft.com/office/word/2012/wordml" xmlns:w16cex="http://schemas.microsoft.com/office/word/2018/wordml/cex" xmlns:w16cid="http://schemas.microsoft.com/office/word/2016/wordml/cid" xmlns:w16="http://schemas.microsoft.com/office/word/2018/wordml" xmlns:w16sdtdh="http://schemas.microsoft.com/office/word/2020/wordml/sdtdatahash" xmlns:w16se="http://schemas.microsoft.com/office/word/2015/wordml/symex" mc:Ignorable="w14 w15 w16se w16cid w16 w16cex w16sdtdh">
   <w:docDefaults>
     <w:rPrDefault>
       <w:rPr>

</xml_diff>

<commit_message>
fix bug in migration and file ref surket
</commit_message>
<xml_diff>
--- a/project/kepegawaian/surat keterangan kepegawaian/surat1.docx
+++ b/project/kepegawaian/surat keterangan kepegawaian/surat1.docx
@@ -37,8 +37,8 @@
         <w:rPr>
           <w:rFonts w:ascii="Times New Roman" w:hAnsi="Times New Roman" w:cs="Times New Roman"/>
           <w:noProof/>
-          <w:sz w:val="28"/>
-          <w:szCs w:val="28"/>
+          <w:sz w:val="24"/>
+          <w:szCs w:val="24"/>
           <w:lang w:val="en-US"/>
         </w:rPr>
       </w:pPr>
@@ -46,65 +46,27 @@
         <w:rPr>
           <w:rFonts w:ascii="Times New Roman" w:hAnsi="Times New Roman" w:cs="Times New Roman"/>
           <w:noProof/>
-          <w:sz w:val="28"/>
-          <w:szCs w:val="28"/>
+          <w:sz w:val="24"/>
+          <w:szCs w:val="24"/>
         </w:rPr>
         <w:t xml:space="preserve">Nomor :   </w:t>
       </w:r>
       <w:r>
         <w:rPr>
           <w:rFonts w:ascii="Times New Roman" w:hAnsi="Times New Roman"/>
-          <w:sz w:val="28"/>
-          <w:szCs w:val="28"/>
+          <w:sz w:val="24"/>
+          <w:szCs w:val="24"/>
         </w:rPr>
         <w:t xml:space="preserve">     /KET/DIR/III.6.AU/PKUSKH/</w:t>
       </w:r>
       <w:r>
         <w:rPr>
           <w:rFonts w:ascii="Times New Roman" w:hAnsi="Times New Roman"/>
-          <w:sz w:val="28"/>
-          <w:szCs w:val="28"/>
+          <w:sz w:val="24"/>
+          <w:szCs w:val="24"/>
           <w:lang w:val="en-US"/>
         </w:rPr>
-        <w:t>${</w:t>
-      </w:r>
-      <w:proofErr w:type="spellStart"/>
-      <w:r>
-        <w:rPr>
-          <w:rFonts w:ascii="Times New Roman" w:hAnsi="Times New Roman"/>
-          <w:sz w:val="28"/>
-          <w:szCs w:val="28"/>
-          <w:lang w:val="en-US"/>
-        </w:rPr>
-        <w:t>th</w:t>
-      </w:r>
-      <w:r>
-        <w:rPr>
-          <w:rFonts w:ascii="Times New Roman" w:hAnsi="Times New Roman"/>
-          <w:sz w:val="28"/>
-          <w:szCs w:val="28"/>
-          <w:lang w:val="en-US"/>
-        </w:rPr>
-        <w:t>_</w:t>
-      </w:r>
-      <w:r>
-        <w:rPr>
-          <w:rFonts w:ascii="Times New Roman" w:hAnsi="Times New Roman"/>
-          <w:sz w:val="28"/>
-          <w:szCs w:val="28"/>
-          <w:lang w:val="en-US"/>
-        </w:rPr>
-        <w:t>surat</w:t>
-      </w:r>
-      <w:proofErr w:type="spellEnd"/>
-      <w:r>
-        <w:rPr>
-          <w:rFonts w:ascii="Times New Roman" w:hAnsi="Times New Roman"/>
-          <w:sz w:val="28"/>
-          <w:szCs w:val="28"/>
-          <w:lang w:val="en-US"/>
-        </w:rPr>
-        <w:t>}</w:t>
+        <w:t>${th_surat}</w:t>
       </w:r>
     </w:p>
     <w:p>
@@ -298,27 +260,7 @@
           <w:szCs w:val="24"/>
           <w:lang w:val="en-US"/>
         </w:rPr>
-        <w:t>${</w:t>
-      </w:r>
-      <w:proofErr w:type="spellStart"/>
-      <w:r>
-        <w:rPr>
-          <w:rFonts w:ascii="Times New Roman" w:hAnsi="Times New Roman"/>
-          <w:sz w:val="24"/>
-          <w:szCs w:val="24"/>
-          <w:lang w:val="en-US"/>
-        </w:rPr>
-        <w:t>nama_direktur</w:t>
-      </w:r>
-      <w:proofErr w:type="spellEnd"/>
-      <w:r>
-        <w:rPr>
-          <w:rFonts w:ascii="Times New Roman" w:hAnsi="Times New Roman"/>
-          <w:sz w:val="24"/>
-          <w:szCs w:val="24"/>
-          <w:lang w:val="en-US"/>
-        </w:rPr>
-        <w:t>}</w:t>
+        <w:t>${nama_direktur}</w:t>
       </w:r>
     </w:p>
     <w:p>
@@ -364,47 +306,7 @@
           <w:szCs w:val="24"/>
           <w:lang w:val="en-US"/>
         </w:rPr>
-        <w:t>${</w:t>
-      </w:r>
-      <w:proofErr w:type="spellStart"/>
-      <w:r>
-        <w:rPr>
-          <w:rFonts w:ascii="Times New Roman" w:hAnsi="Times New Roman"/>
-          <w:sz w:val="24"/>
-          <w:szCs w:val="24"/>
-          <w:lang w:val="en-US"/>
-        </w:rPr>
-        <w:t>jabatan_direktur</w:t>
-      </w:r>
-      <w:proofErr w:type="spellEnd"/>
-      <w:r>
-        <w:rPr>
-          <w:rFonts w:ascii="Times New Roman" w:hAnsi="Times New Roman"/>
-          <w:sz w:val="24"/>
-          <w:szCs w:val="24"/>
-          <w:lang w:val="en-US"/>
-        </w:rPr>
-        <w:t>} ${</w:t>
-      </w:r>
-      <w:proofErr w:type="spellStart"/>
-      <w:r>
-        <w:rPr>
-          <w:rFonts w:ascii="Times New Roman" w:hAnsi="Times New Roman"/>
-          <w:sz w:val="24"/>
-          <w:szCs w:val="24"/>
-          <w:lang w:val="en-US"/>
-        </w:rPr>
-        <w:t>nama_rs</w:t>
-      </w:r>
-      <w:proofErr w:type="spellEnd"/>
-      <w:r>
-        <w:rPr>
-          <w:rFonts w:ascii="Times New Roman" w:hAnsi="Times New Roman"/>
-          <w:sz w:val="24"/>
-          <w:szCs w:val="24"/>
-          <w:lang w:val="en-US"/>
-        </w:rPr>
-        <w:t>}</w:t>
+        <w:t>${jabatan_direktur} ${nama_rs}</w:t>
       </w:r>
     </w:p>
     <w:p>
@@ -455,7 +357,6 @@
         </w:rPr>
         <w:t>${</w:t>
       </w:r>
-      <w:proofErr w:type="spellStart"/>
       <w:r>
         <w:rPr>
           <w:rFonts w:ascii="Times New Roman" w:hAnsi="Times New Roman"/>
@@ -472,17 +373,7 @@
           <w:szCs w:val="24"/>
           <w:lang w:val="en-US"/>
         </w:rPr>
-        <w:t>lamat_rs</w:t>
-      </w:r>
-      <w:proofErr w:type="spellEnd"/>
-      <w:r>
-        <w:rPr>
-          <w:rFonts w:ascii="Times New Roman" w:hAnsi="Times New Roman"/>
-          <w:sz w:val="24"/>
-          <w:szCs w:val="24"/>
-          <w:lang w:val="en-US"/>
-        </w:rPr>
-        <w:t>}</w:t>
+        <w:t>lamat_rs}</w:t>
       </w:r>
       <w:bookmarkStart w:id="2" w:name="_Hlk188013061"/>
     </w:p>
@@ -573,27 +464,7 @@
           <w:szCs w:val="24"/>
           <w:lang w:val="en-US"/>
         </w:rPr>
-        <w:t>${</w:t>
-      </w:r>
-      <w:proofErr w:type="spellStart"/>
-      <w:r>
-        <w:rPr>
-          <w:rFonts w:ascii="Times New Roman" w:hAnsi="Times New Roman"/>
-          <w:sz w:val="24"/>
-          <w:szCs w:val="24"/>
-          <w:lang w:val="en-US"/>
-        </w:rPr>
-        <w:t>pegawai_nama</w:t>
-      </w:r>
-      <w:proofErr w:type="spellEnd"/>
-      <w:r>
-        <w:rPr>
-          <w:rFonts w:ascii="Times New Roman" w:hAnsi="Times New Roman"/>
-          <w:sz w:val="24"/>
-          <w:szCs w:val="24"/>
-          <w:lang w:val="en-US"/>
-        </w:rPr>
-        <w:t>}</w:t>
+        <w:t>${pegawai_nama}</w:t>
       </w:r>
     </w:p>
     <w:p>
@@ -642,27 +513,7 @@
           <w:szCs w:val="24"/>
           <w:lang w:val="en-US"/>
         </w:rPr>
-        <w:t>${</w:t>
-      </w:r>
-      <w:proofErr w:type="spellStart"/>
-      <w:r>
-        <w:rPr>
-          <w:rFonts w:ascii="Times New Roman" w:hAnsi="Times New Roman"/>
-          <w:sz w:val="24"/>
-          <w:szCs w:val="24"/>
-          <w:lang w:val="en-US"/>
-        </w:rPr>
-        <w:t>pegawai_ttl</w:t>
-      </w:r>
-      <w:proofErr w:type="spellEnd"/>
-      <w:r>
-        <w:rPr>
-          <w:rFonts w:ascii="Times New Roman" w:hAnsi="Times New Roman"/>
-          <w:sz w:val="24"/>
-          <w:szCs w:val="24"/>
-          <w:lang w:val="en-US"/>
-        </w:rPr>
-        <w:t>}</w:t>
+        <w:t>${pegawai_ttl}</w:t>
       </w:r>
     </w:p>
     <w:p>
@@ -708,27 +559,7 @@
           <w:szCs w:val="24"/>
           <w:lang w:val="en-US"/>
         </w:rPr>
-        <w:t>${</w:t>
-      </w:r>
-      <w:proofErr w:type="spellStart"/>
-      <w:r>
-        <w:rPr>
-          <w:rFonts w:ascii="Times New Roman" w:hAnsi="Times New Roman"/>
-          <w:sz w:val="24"/>
-          <w:szCs w:val="24"/>
-          <w:lang w:val="en-US"/>
-        </w:rPr>
-        <w:t>pegawai_pendidikan</w:t>
-      </w:r>
-      <w:proofErr w:type="spellEnd"/>
-      <w:r>
-        <w:rPr>
-          <w:rFonts w:ascii="Times New Roman" w:hAnsi="Times New Roman"/>
-          <w:sz w:val="24"/>
-          <w:szCs w:val="24"/>
-          <w:lang w:val="en-US"/>
-        </w:rPr>
-        <w:t>}</w:t>
+        <w:t>${pegawai_pendidikan}</w:t>
       </w:r>
     </w:p>
     <w:p>
@@ -782,27 +613,7 @@
           <w:szCs w:val="24"/>
           <w:lang w:val="en-US"/>
         </w:rPr>
-        <w:t>${</w:t>
-      </w:r>
-      <w:proofErr w:type="spellStart"/>
-      <w:r>
-        <w:rPr>
-          <w:rFonts w:ascii="Times New Roman" w:hAnsi="Times New Roman"/>
-          <w:sz w:val="24"/>
-          <w:szCs w:val="24"/>
-          <w:lang w:val="en-US"/>
-        </w:rPr>
-        <w:t>pegawai_alamat</w:t>
-      </w:r>
-      <w:proofErr w:type="spellEnd"/>
-      <w:r>
-        <w:rPr>
-          <w:rFonts w:ascii="Times New Roman" w:hAnsi="Times New Roman"/>
-          <w:sz w:val="24"/>
-          <w:szCs w:val="24"/>
-          <w:lang w:val="en-US"/>
-        </w:rPr>
-        <w:t>}</w:t>
+        <w:t>${pegawai_alamat}</w:t>
       </w:r>
     </w:p>
     <w:bookmarkEnd w:id="0"/>
@@ -838,9 +649,8 @@
           <w:szCs w:val="24"/>
           <w:lang w:val="en-US"/>
         </w:rPr>
-        <w:t>${</w:t>
-      </w:r>
-      <w:proofErr w:type="spellStart"/>
+        <w:t xml:space="preserve">${profesi} </w:t>
+      </w:r>
       <w:r>
         <w:rPr>
           <w:rFonts w:ascii="Times New Roman" w:hAnsi="Times New Roman" w:cs="Times New Roman"/>
@@ -848,11 +658,18 @@
           <w:color w:val="0D0D0D" w:themeColor="text1" w:themeTint="F2"/>
           <w:sz w:val="24"/>
           <w:szCs w:val="24"/>
+        </w:rPr>
+        <w:t xml:space="preserve">Rumah Sakit PKU Muhammadiyah Sukoharjo terhitung mulai tanggal </w:t>
+      </w:r>
+      <w:r>
+        <w:rPr>
+          <w:rFonts w:ascii="Times New Roman" w:hAnsi="Times New Roman"/>
+          <w:sz w:val="24"/>
+          <w:szCs w:val="24"/>
           <w:lang w:val="en-US"/>
         </w:rPr>
-        <w:t>profesi</w:t>
-      </w:r>
-      <w:proofErr w:type="spellEnd"/>
+        <w:t>${pegawai_tmt}</w:t>
+      </w:r>
       <w:r>
         <w:rPr>
           <w:rFonts w:ascii="Times New Roman" w:hAnsi="Times New Roman" w:cs="Times New Roman"/>
@@ -862,7 +679,7 @@
           <w:szCs w:val="24"/>
           <w:lang w:val="en-US"/>
         </w:rPr>
-        <w:t xml:space="preserve">} </w:t>
+        <w:t xml:space="preserve"> </w:t>
       </w:r>
       <w:r>
         <w:rPr>
@@ -872,36 +689,7 @@
           <w:sz w:val="24"/>
           <w:szCs w:val="24"/>
         </w:rPr>
-        <w:t xml:space="preserve">Rumah Sakit PKU Muhammadiyah Sukoharjo terhitung mulai tanggal </w:t>
-      </w:r>
-      <w:r>
-        <w:rPr>
-          <w:rFonts w:ascii="Times New Roman" w:hAnsi="Times New Roman"/>
-          <w:sz w:val="24"/>
-          <w:szCs w:val="24"/>
-          <w:lang w:val="en-US"/>
-        </w:rPr>
-        <w:t>${</w:t>
-      </w:r>
-      <w:proofErr w:type="spellStart"/>
-      <w:r>
-        <w:rPr>
-          <w:rFonts w:ascii="Times New Roman" w:hAnsi="Times New Roman"/>
-          <w:sz w:val="24"/>
-          <w:szCs w:val="24"/>
-          <w:lang w:val="en-US"/>
-        </w:rPr>
-        <w:t>pegawai_tmt</w:t>
-      </w:r>
-      <w:proofErr w:type="spellEnd"/>
-      <w:r>
-        <w:rPr>
-          <w:rFonts w:ascii="Times New Roman" w:hAnsi="Times New Roman"/>
-          <w:sz w:val="24"/>
-          <w:szCs w:val="24"/>
-          <w:lang w:val="en-US"/>
-        </w:rPr>
-        <w:t>}</w:t>
+        <w:t>sampai dengan sekarang</w:t>
       </w:r>
       <w:r>
         <w:rPr>
@@ -912,8 +700,20 @@
           <w:szCs w:val="24"/>
           <w:lang w:val="en-US"/>
         </w:rPr>
-        <w:t xml:space="preserve"> </w:t>
-      </w:r>
+        <w:t>.</w:t>
+      </w:r>
+    </w:p>
+    <w:p>
+      <w:pPr>
+        <w:spacing w:after="0" w:line="360" w:lineRule="auto"/>
+        <w:ind w:left="567" w:right="709"/>
+        <w:jc w:val="both"/>
+        <w:rPr>
+          <w:rFonts w:ascii="Times New Roman" w:hAnsi="Times New Roman"/>
+          <w:sz w:val="24"/>
+          <w:szCs w:val="24"/>
+        </w:rPr>
+      </w:pPr>
       <w:r>
         <w:rPr>
           <w:rFonts w:ascii="Times New Roman" w:hAnsi="Times New Roman" w:cs="Times New Roman"/>
@@ -922,7 +722,7 @@
           <w:sz w:val="24"/>
           <w:szCs w:val="24"/>
         </w:rPr>
-        <w:t>sampai dengan sekarang</w:t>
+        <w:t xml:space="preserve">Demikian surat keterangan ini dibuat guna </w:t>
       </w:r>
       <w:r>
         <w:rPr>
@@ -931,22 +731,9 @@
           <w:color w:val="0D0D0D" w:themeColor="text1" w:themeTint="F2"/>
           <w:sz w:val="24"/>
           <w:szCs w:val="24"/>
-          <w:lang w:val="en-US"/>
-        </w:rPr>
-        <w:t>.</w:t>
-      </w:r>
-    </w:p>
-    <w:p>
-      <w:pPr>
-        <w:spacing w:after="0" w:line="360" w:lineRule="auto"/>
-        <w:ind w:left="567" w:right="709"/>
-        <w:jc w:val="both"/>
-        <w:rPr>
-          <w:rFonts w:ascii="Times New Roman" w:hAnsi="Times New Roman"/>
-          <w:sz w:val="24"/>
-          <w:szCs w:val="24"/>
-        </w:rPr>
-      </w:pPr>
+        </w:rPr>
+        <w:t>mengurus</w:t>
+      </w:r>
       <w:r>
         <w:rPr>
           <w:rFonts w:ascii="Times New Roman" w:hAnsi="Times New Roman" w:cs="Times New Roman"/>
@@ -955,7 +742,7 @@
           <w:sz w:val="24"/>
           <w:szCs w:val="24"/>
         </w:rPr>
-        <w:t xml:space="preserve">Demikian surat keterangan ini dibuat guna </w:t>
+        <w:t xml:space="preserve"> Surat Tanda Registrasi</w:t>
       </w:r>
       <w:r>
         <w:rPr>
@@ -965,7 +752,7 @@
           <w:sz w:val="24"/>
           <w:szCs w:val="24"/>
         </w:rPr>
-        <w:t>mengurus</w:t>
+        <w:t xml:space="preserve"> </w:t>
       </w:r>
       <w:r>
         <w:rPr>
@@ -975,7 +762,7 @@
           <w:sz w:val="24"/>
           <w:szCs w:val="24"/>
         </w:rPr>
-        <w:t xml:space="preserve"> Surat Tanda Registrasi</w:t>
+        <w:t>(</w:t>
       </w:r>
       <w:r>
         <w:rPr>
@@ -985,7 +772,7 @@
           <w:sz w:val="24"/>
           <w:szCs w:val="24"/>
         </w:rPr>
-        <w:t xml:space="preserve"> </w:t>
+        <w:t>STR</w:t>
       </w:r>
       <w:r>
         <w:rPr>
@@ -995,7 +782,7 @@
           <w:sz w:val="24"/>
           <w:szCs w:val="24"/>
         </w:rPr>
-        <w:t>(</w:t>
+        <w:t>)</w:t>
       </w:r>
       <w:r>
         <w:rPr>
@@ -1005,8 +792,28 @@
           <w:sz w:val="24"/>
           <w:szCs w:val="24"/>
         </w:rPr>
-        <w:t>STR</w:t>
-      </w:r>
+        <w:t xml:space="preserve"> dan dapat dipergunakan sebagaimana mestinya.  </w:t>
+      </w:r>
+      <w:r>
+        <w:rPr>
+          <w:rFonts w:ascii="Times New Roman" w:hAnsi="Times New Roman"/>
+          <w:sz w:val="24"/>
+          <w:szCs w:val="24"/>
+        </w:rPr>
+        <w:t xml:space="preserve">  </w:t>
+      </w:r>
+    </w:p>
+    <w:p>
+      <w:pPr>
+        <w:spacing w:after="0" w:line="360" w:lineRule="auto"/>
+        <w:ind w:left="284" w:right="709"/>
+        <w:jc w:val="both"/>
+        <w:rPr>
+          <w:rFonts w:ascii="Times New Roman" w:hAnsi="Times New Roman"/>
+          <w:sz w:val="24"/>
+          <w:szCs w:val="24"/>
+        </w:rPr>
+      </w:pPr>
       <w:r>
         <w:rPr>
           <w:rFonts w:ascii="Times New Roman" w:hAnsi="Times New Roman" w:cs="Times New Roman"/>
@@ -1015,46 +822,6 @@
           <w:sz w:val="24"/>
           <w:szCs w:val="24"/>
         </w:rPr>
-        <w:t>)</w:t>
-      </w:r>
-      <w:r>
-        <w:rPr>
-          <w:rFonts w:ascii="Times New Roman" w:hAnsi="Times New Roman" w:cs="Times New Roman"/>
-          <w:iCs/>
-          <w:color w:val="0D0D0D" w:themeColor="text1" w:themeTint="F2"/>
-          <w:sz w:val="24"/>
-          <w:szCs w:val="24"/>
-        </w:rPr>
-        <w:t xml:space="preserve"> dan dapat dipergunakan sebagaimana mestinya.  </w:t>
-      </w:r>
-      <w:r>
-        <w:rPr>
-          <w:rFonts w:ascii="Times New Roman" w:hAnsi="Times New Roman"/>
-          <w:sz w:val="24"/>
-          <w:szCs w:val="24"/>
-        </w:rPr>
-        <w:t xml:space="preserve">  </w:t>
-      </w:r>
-    </w:p>
-    <w:p>
-      <w:pPr>
-        <w:spacing w:after="0" w:line="360" w:lineRule="auto"/>
-        <w:ind w:left="284" w:right="709"/>
-        <w:jc w:val="both"/>
-        <w:rPr>
-          <w:rFonts w:ascii="Times New Roman" w:hAnsi="Times New Roman"/>
-          <w:sz w:val="24"/>
-          <w:szCs w:val="24"/>
-        </w:rPr>
-      </w:pPr>
-      <w:r>
-        <w:rPr>
-          <w:rFonts w:ascii="Times New Roman" w:hAnsi="Times New Roman" w:cs="Times New Roman"/>
-          <w:iCs/>
-          <w:color w:val="0D0D0D" w:themeColor="text1" w:themeTint="F2"/>
-          <w:sz w:val="24"/>
-          <w:szCs w:val="24"/>
-        </w:rPr>
         <w:t xml:space="preserve">  </w:t>
       </w:r>
       <w:r>
@@ -1095,9 +862,26 @@
           <w:u w:val="single"/>
           <w:lang w:val="en-US"/>
         </w:rPr>
-        <w:t>${</w:t>
-      </w:r>
-      <w:proofErr w:type="spellStart"/>
+        <w:t>${tgl_surat}</w:t>
+      </w:r>
+      <w:r>
+        <w:rPr>
+          <w:rFonts w:ascii="Times New Roman" w:hAnsi="Times New Roman"/>
+          <w:sz w:val="24"/>
+          <w:szCs w:val="24"/>
+          <w:u w:val="single"/>
+        </w:rPr>
+        <w:t xml:space="preserve">     </w:t>
+      </w:r>
+      <w:r>
+        <w:rPr>
+          <w:rFonts w:ascii="Times New Roman" w:hAnsi="Times New Roman"/>
+          <w:sz w:val="24"/>
+          <w:szCs w:val="24"/>
+          <w:u w:val="single"/>
+        </w:rPr>
+        <w:tab/>
+      </w:r>
       <w:r>
         <w:rPr>
           <w:rFonts w:ascii="Times New Roman" w:hAnsi="Times New Roman"/>
@@ -1106,9 +890,8 @@
           <w:u w:val="single"/>
           <w:lang w:val="en-US"/>
         </w:rPr>
-        <w:t>tgl_surat</w:t>
-      </w:r>
-      <w:proofErr w:type="spellEnd"/>
+        <w:t xml:space="preserve">     </w:t>
+      </w:r>
       <w:r>
         <w:rPr>
           <w:rFonts w:ascii="Times New Roman" w:hAnsi="Times New Roman"/>
@@ -1117,67 +900,7 @@
           <w:u w:val="single"/>
           <w:lang w:val="en-US"/>
         </w:rPr>
-        <w:t>}</w:t>
-      </w:r>
-      <w:r>
-        <w:rPr>
-          <w:rFonts w:ascii="Times New Roman" w:hAnsi="Times New Roman"/>
-          <w:sz w:val="24"/>
-          <w:szCs w:val="24"/>
-          <w:u w:val="single"/>
-        </w:rPr>
-        <w:t xml:space="preserve">     </w:t>
-      </w:r>
-      <w:r>
-        <w:rPr>
-          <w:rFonts w:ascii="Times New Roman" w:hAnsi="Times New Roman"/>
-          <w:sz w:val="24"/>
-          <w:szCs w:val="24"/>
-          <w:u w:val="single"/>
-        </w:rPr>
-        <w:tab/>
-      </w:r>
-      <w:r>
-        <w:rPr>
-          <w:rFonts w:ascii="Times New Roman" w:hAnsi="Times New Roman"/>
-          <w:sz w:val="24"/>
-          <w:szCs w:val="24"/>
-          <w:u w:val="single"/>
-          <w:lang w:val="en-US"/>
-        </w:rPr>
-        <w:t xml:space="preserve">     </w:t>
-      </w:r>
-      <w:r>
-        <w:rPr>
-          <w:rFonts w:ascii="Times New Roman" w:hAnsi="Times New Roman"/>
-          <w:sz w:val="24"/>
-          <w:szCs w:val="24"/>
-          <w:u w:val="single"/>
-          <w:lang w:val="en-US"/>
-        </w:rPr>
-        <w:t>${</w:t>
-      </w:r>
-      <w:proofErr w:type="spellStart"/>
-      <w:r>
-        <w:rPr>
-          <w:rFonts w:ascii="Times New Roman" w:hAnsi="Times New Roman"/>
-          <w:sz w:val="24"/>
-          <w:szCs w:val="24"/>
-          <w:u w:val="single"/>
-          <w:lang w:val="en-US"/>
-        </w:rPr>
-        <w:t>th_surat</w:t>
-      </w:r>
-      <w:proofErr w:type="spellEnd"/>
-      <w:r>
-        <w:rPr>
-          <w:rFonts w:ascii="Times New Roman" w:hAnsi="Times New Roman"/>
-          <w:sz w:val="24"/>
-          <w:szCs w:val="24"/>
-          <w:u w:val="single"/>
-          <w:lang w:val="en-US"/>
-        </w:rPr>
-        <w:t>}</w:t>
+        <w:t>${th_surat}</w:t>
       </w:r>
       <w:r>
         <w:rPr>
@@ -1348,29 +1071,7 @@
           <w:u w:val="single"/>
           <w:lang w:val="en-US"/>
         </w:rPr>
-        <w:t>${</w:t>
-      </w:r>
-      <w:proofErr w:type="spellStart"/>
-      <w:r>
-        <w:rPr>
-          <w:rFonts w:ascii="Times New Roman" w:hAnsi="Times New Roman"/>
-          <w:sz w:val="24"/>
-          <w:szCs w:val="24"/>
-          <w:u w:val="single"/>
-          <w:lang w:val="en-US"/>
-        </w:rPr>
-        <w:t>nama_direktur</w:t>
-      </w:r>
-      <w:proofErr w:type="spellEnd"/>
-      <w:r>
-        <w:rPr>
-          <w:rFonts w:ascii="Times New Roman" w:hAnsi="Times New Roman"/>
-          <w:sz w:val="24"/>
-          <w:szCs w:val="24"/>
-          <w:u w:val="single"/>
-          <w:lang w:val="en-US"/>
-        </w:rPr>
-        <w:t>}</w:t>
+        <w:t>${nama_direktur}</w:t>
       </w:r>
     </w:p>
     <w:p>
@@ -1463,27 +1164,7 @@
           <w:szCs w:val="24"/>
           <w:lang w:val="en-US"/>
         </w:rPr>
-        <w:t>${</w:t>
-      </w:r>
-      <w:proofErr w:type="spellStart"/>
-      <w:r>
-        <w:rPr>
-          <w:rFonts w:ascii="Times New Roman" w:hAnsi="Times New Roman"/>
-          <w:sz w:val="24"/>
-          <w:szCs w:val="24"/>
-          <w:lang w:val="en-US"/>
-        </w:rPr>
-        <w:t>nbm</w:t>
-      </w:r>
-      <w:proofErr w:type="spellEnd"/>
-      <w:r>
-        <w:rPr>
-          <w:rFonts w:ascii="Times New Roman" w:hAnsi="Times New Roman"/>
-          <w:sz w:val="24"/>
-          <w:szCs w:val="24"/>
-          <w:lang w:val="en-US"/>
-        </w:rPr>
-        <w:t>}</w:t>
+        <w:t>${nbm}</w:t>
       </w:r>
     </w:p>
     <w:bookmarkEnd w:id="3"/>

</xml_diff>